<commit_message>
feat(tracking & lpr): improve vehicle tracker re-id, enhance LPR detection pipeline, and update monitoring service
</commit_message>
<xml_diff>
--- a/docs/Secretarys-Minutes-Multicab2.docx
+++ b/docs/Secretarys-Minutes-Multicab2.docx
@@ -7,9 +7,17 @@
         <w:pStyle w:val="Heading1"/>
         <w:spacing w:after="255"/>
         <w:ind w:right="513"/>
+        <w:rPr>
+          <w:sz w:val="22"/>
+          <w:szCs w:val="22"/>
+        </w:rPr>
       </w:pPr>
       <w:r>
-        <w:t>SECRETARY’S MINUTES</w:t>
+        <w:rPr>
+          <w:sz w:val="22"/>
+          <w:szCs w:val="22"/>
+        </w:rPr>
+        <w:t>ACTION DONE MATRIX</w:t>
       </w:r>
     </w:p>
     <w:p>
@@ -17,30 +25,33 @@
         <w:spacing w:after="246"/>
         <w:ind w:left="644" w:hanging="10"/>
         <w:rPr>
-          <w:rFonts w:ascii="Times New Roman" w:hAnsi="Times New Roman" w:cs="Times New Roman"/>
+          <w:rFonts w:ascii="Times New Roman" w:eastAsia="Times New Roman" w:hAnsi="Times New Roman" w:cs="Times New Roman"/>
+          <w:b/>
+          <w:szCs w:val="22"/>
         </w:rPr>
       </w:pPr>
       <w:r>
         <w:rPr>
-          <w:rFonts w:ascii="Times New Roman" w:eastAsia="Times New Roman" w:hAnsi="Times New Roman" w:cs="Times New Roman"/>
-          <w:sz w:val="24"/>
-        </w:rPr>
-        <w:t>Title of Paper:</w:t>
-      </w:r>
-      <w:r>
-        <w:rPr>
-          <w:rFonts w:ascii="Times New Roman" w:eastAsia="Times New Roman" w:hAnsi="Times New Roman" w:cs="Times New Roman"/>
+          <w:rFonts w:eastAsia="Times New Roman"/>
           <w:b/>
-          <w:sz w:val="24"/>
-        </w:rPr>
-        <w:t xml:space="preserve"> </w:t>
+          <w:szCs w:val="22"/>
+        </w:rPr>
+        <w:t xml:space="preserve">Capstone Project Title: </w:t>
+      </w:r>
+      <w:r>
+        <w:rPr>
+          <w:rFonts w:ascii="Times New Roman" w:eastAsia="Times New Roman" w:hAnsi="Times New Roman" w:cs="Times New Roman"/>
+          <w:b/>
+          <w:szCs w:val="22"/>
+        </w:rPr>
+        <w:t xml:space="preserve">AI-Powered </w:t>
       </w:r>
       <w:proofErr w:type="spellStart"/>
       <w:r>
         <w:rPr>
           <w:rFonts w:ascii="Times New Roman" w:eastAsia="Times New Roman" w:hAnsi="Times New Roman" w:cs="Times New Roman"/>
           <w:b/>
-          <w:sz w:val="24"/>
+          <w:szCs w:val="22"/>
         </w:rPr>
         <w:t>Multicab</w:t>
       </w:r>
@@ -49,512 +60,57 @@
         <w:rPr>
           <w:rFonts w:ascii="Times New Roman" w:eastAsia="Times New Roman" w:hAnsi="Times New Roman" w:cs="Times New Roman"/>
           <w:b/>
-          <w:sz w:val="24"/>
-        </w:rPr>
-        <w:t xml:space="preserve"> Stop Time Monitoring System using AI Based Camera Detection</w:t>
-      </w:r>
-      <w:r>
-        <w:rPr>
-          <w:rFonts w:ascii="Times New Roman" w:eastAsia="Cambria" w:hAnsi="Times New Roman" w:cs="Times New Roman"/>
-          <w:sz w:val="24"/>
-        </w:rPr>
-        <w:tab/>
+          <w:szCs w:val="22"/>
+        </w:rPr>
+        <w:t xml:space="preserve"> Stop-Time Monitoring System Using Camera-Based Detection</w:t>
       </w:r>
     </w:p>
     <w:p>
       <w:pPr>
-        <w:tabs>
-          <w:tab w:val="center" w:pos="1668"/>
-          <w:tab w:val="center" w:pos="2864"/>
-        </w:tabs>
-        <w:spacing w:after="115"/>
-        <w:rPr>
-          <w:rFonts w:ascii="Times New Roman" w:hAnsi="Times New Roman" w:cs="Times New Roman"/>
+        <w:spacing w:after="246"/>
+        <w:ind w:left="644" w:hanging="10"/>
+        <w:rPr>
+          <w:rFonts w:ascii="Times New Roman" w:eastAsia="Times New Roman" w:hAnsi="Times New Roman" w:cs="Times New Roman"/>
+          <w:b/>
+          <w:szCs w:val="22"/>
         </w:rPr>
       </w:pPr>
       <w:r>
         <w:rPr>
-          <w:rFonts w:ascii="Times New Roman" w:hAnsi="Times New Roman" w:cs="Times New Roman"/>
-        </w:rPr>
-        <w:tab/>
-      </w:r>
-      <w:r>
-        <w:rPr>
-          <w:rFonts w:ascii="Times New Roman" w:eastAsia="Times New Roman" w:hAnsi="Times New Roman" w:cs="Times New Roman"/>
-          <w:sz w:val="24"/>
-        </w:rPr>
-        <w:t xml:space="preserve">Name of Proponents: </w:t>
-      </w:r>
-      <w:r>
-        <w:rPr>
-          <w:rFonts w:ascii="Times New Roman" w:eastAsia="Cambria" w:hAnsi="Times New Roman" w:cs="Times New Roman"/>
-        </w:rPr>
-        <w:tab/>
+          <w:rFonts w:ascii="Times New Roman" w:eastAsia="Times New Roman" w:hAnsi="Times New Roman" w:cs="Times New Roman"/>
+          <w:b/>
+          <w:szCs w:val="22"/>
+        </w:rPr>
+        <w:t>Note to the Researchers</w:t>
+      </w:r>
+      <w:proofErr w:type="gramStart"/>
+      <w:r>
+        <w:rPr>
+          <w:rFonts w:ascii="Times New Roman" w:eastAsia="Times New Roman" w:hAnsi="Times New Roman" w:cs="Times New Roman"/>
+          <w:b/>
+          <w:szCs w:val="22"/>
+        </w:rPr>
+        <w:t>:  Please</w:t>
+      </w:r>
+      <w:proofErr w:type="gramEnd"/>
+      <w:r>
+        <w:rPr>
+          <w:rFonts w:ascii="Times New Roman" w:eastAsia="Times New Roman" w:hAnsi="Times New Roman" w:cs="Times New Roman"/>
+          <w:b/>
+          <w:szCs w:val="22"/>
+        </w:rPr>
+        <w:t xml:space="preserve"> submit this form with the revised paper that shall be forwarded to the Capstone Committee/Instructor)</w:t>
       </w:r>
     </w:p>
     <w:p>
       <w:pPr>
-        <w:spacing w:after="0"/>
-        <w:ind w:left="1373" w:hanging="10"/>
+        <w:spacing w:after="246"/>
+        <w:ind w:left="644" w:hanging="10"/>
         <w:rPr>
           <w:rFonts w:ascii="Times New Roman" w:hAnsi="Times New Roman" w:cs="Times New Roman"/>
+          <w:szCs w:val="22"/>
         </w:rPr>
       </w:pPr>
-      <w:r>
-        <w:rPr>
-          <w:rFonts w:ascii="Times New Roman" w:eastAsia="Times New Roman" w:hAnsi="Times New Roman" w:cs="Times New Roman"/>
-          <w:b/>
-          <w:sz w:val="24"/>
-        </w:rPr>
-        <w:t>Michael Angelo Angeles</w:t>
-      </w:r>
-    </w:p>
-    <w:p>
-      <w:pPr>
-        <w:spacing w:after="0"/>
-        <w:ind w:left="1373" w:hanging="10"/>
-        <w:rPr>
-          <w:rFonts w:ascii="Times New Roman" w:hAnsi="Times New Roman" w:cs="Times New Roman"/>
-        </w:rPr>
-      </w:pPr>
-      <w:r>
-        <w:rPr>
-          <w:rFonts w:ascii="Times New Roman" w:eastAsia="Times New Roman" w:hAnsi="Times New Roman" w:cs="Times New Roman"/>
-          <w:b/>
-          <w:sz w:val="24"/>
-        </w:rPr>
-        <w:t>Elton John Muralla</w:t>
-      </w:r>
-    </w:p>
-    <w:p>
-      <w:pPr>
-        <w:spacing w:after="0"/>
-        <w:ind w:left="1373" w:hanging="10"/>
-        <w:rPr>
-          <w:rFonts w:ascii="Times New Roman" w:hAnsi="Times New Roman" w:cs="Times New Roman"/>
-        </w:rPr>
-      </w:pPr>
-      <w:r>
-        <w:rPr>
-          <w:rFonts w:ascii="Times New Roman" w:eastAsia="Times New Roman" w:hAnsi="Times New Roman" w:cs="Times New Roman"/>
-          <w:b/>
-          <w:sz w:val="24"/>
-        </w:rPr>
-        <w:t>Jesse Pepito</w:t>
-      </w:r>
-    </w:p>
-    <w:p>
-      <w:pPr>
-        <w:spacing w:after="305"/>
-        <w:ind w:left="1373" w:hanging="10"/>
-        <w:rPr>
-          <w:rFonts w:ascii="Times New Roman" w:hAnsi="Times New Roman" w:cs="Times New Roman"/>
-        </w:rPr>
-      </w:pPr>
-      <w:r>
-        <w:rPr>
-          <w:rFonts w:ascii="Times New Roman" w:eastAsia="Times New Roman" w:hAnsi="Times New Roman" w:cs="Times New Roman"/>
-          <w:b/>
-          <w:sz w:val="24"/>
-        </w:rPr>
-        <w:t xml:space="preserve">Zurich </w:t>
-      </w:r>
-      <w:proofErr w:type="spellStart"/>
-      <w:r>
-        <w:rPr>
-          <w:rFonts w:ascii="Times New Roman" w:eastAsia="Times New Roman" w:hAnsi="Times New Roman" w:cs="Times New Roman"/>
-          <w:b/>
-          <w:sz w:val="24"/>
-        </w:rPr>
-        <w:t>Cabanelez</w:t>
-      </w:r>
-      <w:proofErr w:type="spellEnd"/>
-    </w:p>
-    <w:p>
-      <w:pPr>
-        <w:spacing w:after="271"/>
-        <w:ind w:left="650" w:hanging="10"/>
-        <w:rPr>
-          <w:rFonts w:ascii="Times New Roman" w:hAnsi="Times New Roman" w:cs="Times New Roman"/>
-        </w:rPr>
-      </w:pPr>
-      <w:r>
-        <w:rPr>
-          <w:rFonts w:ascii="Times New Roman" w:eastAsia="Times New Roman" w:hAnsi="Times New Roman" w:cs="Times New Roman"/>
-          <w:sz w:val="24"/>
-        </w:rPr>
-        <w:t xml:space="preserve">Type of Defense: </w:t>
-      </w:r>
-      <w:proofErr w:type="gramStart"/>
-      <w:r>
-        <w:rPr>
-          <w:rFonts w:ascii="Times New Roman" w:eastAsia="Times New Roman" w:hAnsi="Times New Roman" w:cs="Times New Roman"/>
-          <w:b/>
-          <w:sz w:val="24"/>
-        </w:rPr>
-        <w:t>( )</w:t>
-      </w:r>
-      <w:proofErr w:type="gramEnd"/>
-      <w:r>
-        <w:rPr>
-          <w:rFonts w:ascii="Times New Roman" w:eastAsia="Times New Roman" w:hAnsi="Times New Roman" w:cs="Times New Roman"/>
-          <w:b/>
-          <w:sz w:val="24"/>
-        </w:rPr>
-        <w:t xml:space="preserve"> Proposal </w:t>
-      </w:r>
-      <w:proofErr w:type="gramStart"/>
-      <w:r>
-        <w:rPr>
-          <w:rFonts w:ascii="Times New Roman" w:eastAsia="Times New Roman" w:hAnsi="Times New Roman" w:cs="Times New Roman"/>
-          <w:b/>
-          <w:sz w:val="24"/>
-        </w:rPr>
-        <w:t>Defense  (</w:t>
-      </w:r>
-      <w:proofErr w:type="gramEnd"/>
-      <w:r>
-        <w:rPr>
-          <w:rFonts w:ascii="Times New Roman" w:eastAsia="Times New Roman" w:hAnsi="Times New Roman" w:cs="Times New Roman"/>
-          <w:b/>
-          <w:sz w:val="24"/>
-        </w:rPr>
-        <w:t xml:space="preserve"> </w:t>
-      </w:r>
-      <w:proofErr w:type="gramStart"/>
-      <w:r>
-        <w:rPr>
-          <w:rFonts w:ascii="Segoe UI Symbol" w:hAnsi="Segoe UI Symbol" w:cs="Segoe UI Symbol"/>
-          <w:b/>
-          <w:sz w:val="24"/>
-        </w:rPr>
-        <w:t>✓</w:t>
-      </w:r>
-      <w:r>
-        <w:rPr>
-          <w:rFonts w:ascii="Times New Roman" w:eastAsia="Arial" w:hAnsi="Times New Roman" w:cs="Times New Roman"/>
-          <w:b/>
-          <w:sz w:val="24"/>
-        </w:rPr>
-        <w:t xml:space="preserve"> </w:t>
-      </w:r>
-      <w:r>
-        <w:rPr>
-          <w:rFonts w:ascii="Times New Roman" w:eastAsia="Times New Roman" w:hAnsi="Times New Roman" w:cs="Times New Roman"/>
-          <w:b/>
-          <w:sz w:val="24"/>
-        </w:rPr>
-        <w:t>)</w:t>
-      </w:r>
-      <w:proofErr w:type="gramEnd"/>
-      <w:r>
-        <w:rPr>
-          <w:rFonts w:ascii="Times New Roman" w:eastAsia="Times New Roman" w:hAnsi="Times New Roman" w:cs="Times New Roman"/>
-          <w:b/>
-          <w:sz w:val="24"/>
-        </w:rPr>
-        <w:t xml:space="preserve"> System Defense</w:t>
-      </w:r>
-      <w:proofErr w:type="gramStart"/>
-      <w:r>
-        <w:rPr>
-          <w:rFonts w:ascii="Times New Roman" w:eastAsia="Times New Roman" w:hAnsi="Times New Roman" w:cs="Times New Roman"/>
-          <w:b/>
-          <w:sz w:val="24"/>
-        </w:rPr>
-        <w:t xml:space="preserve">   (</w:t>
-      </w:r>
-      <w:proofErr w:type="gramEnd"/>
-      <w:r>
-        <w:rPr>
-          <w:rFonts w:ascii="Times New Roman" w:eastAsia="Times New Roman" w:hAnsi="Times New Roman" w:cs="Times New Roman"/>
-          <w:b/>
-          <w:sz w:val="24"/>
-        </w:rPr>
-        <w:t xml:space="preserve"> ) Final Defense</w:t>
-      </w:r>
-    </w:p>
-    <w:p>
-      <w:pPr>
-        <w:spacing w:after="229"/>
-        <w:ind w:left="650" w:hanging="10"/>
-        <w:rPr>
-          <w:rFonts w:ascii="Times New Roman" w:hAnsi="Times New Roman" w:cs="Times New Roman"/>
-        </w:rPr>
-      </w:pPr>
-      <w:r>
-        <w:rPr>
-          <w:rFonts w:ascii="Times New Roman" w:eastAsia="Times New Roman" w:hAnsi="Times New Roman" w:cs="Times New Roman"/>
-          <w:sz w:val="24"/>
-        </w:rPr>
-        <w:t xml:space="preserve">Number of Rounds: </w:t>
-      </w:r>
-      <w:proofErr w:type="gramStart"/>
-      <w:r>
-        <w:rPr>
-          <w:rFonts w:ascii="Times New Roman" w:eastAsia="Times New Roman" w:hAnsi="Times New Roman" w:cs="Times New Roman"/>
-          <w:b/>
-          <w:sz w:val="24"/>
-        </w:rPr>
-        <w:t xml:space="preserve">( </w:t>
-      </w:r>
-      <w:r>
-        <w:rPr>
-          <w:rFonts w:ascii="Segoe UI Symbol" w:hAnsi="Segoe UI Symbol" w:cs="Segoe UI Symbol"/>
-          <w:b/>
-          <w:sz w:val="24"/>
-        </w:rPr>
-        <w:t>✓</w:t>
-      </w:r>
-      <w:proofErr w:type="gramEnd"/>
-      <w:r>
-        <w:rPr>
-          <w:rFonts w:ascii="Times New Roman" w:eastAsia="Times New Roman" w:hAnsi="Times New Roman" w:cs="Times New Roman"/>
-          <w:b/>
-          <w:sz w:val="24"/>
-        </w:rPr>
-        <w:t xml:space="preserve"> ) 1</w:t>
-      </w:r>
-      <w:r>
-        <w:rPr>
-          <w:rFonts w:ascii="Times New Roman" w:eastAsia="Times New Roman" w:hAnsi="Times New Roman" w:cs="Times New Roman"/>
-          <w:b/>
-          <w:sz w:val="24"/>
-          <w:vertAlign w:val="superscript"/>
-        </w:rPr>
-        <w:t>st</w:t>
-      </w:r>
-      <w:proofErr w:type="gramStart"/>
-      <w:r>
-        <w:rPr>
-          <w:rFonts w:ascii="Times New Roman" w:eastAsia="Times New Roman" w:hAnsi="Times New Roman" w:cs="Times New Roman"/>
-          <w:b/>
-          <w:sz w:val="24"/>
-        </w:rPr>
-        <w:t xml:space="preserve">   (  )</w:t>
-      </w:r>
-      <w:proofErr w:type="gramEnd"/>
-      <w:r>
-        <w:rPr>
-          <w:rFonts w:ascii="Times New Roman" w:eastAsia="Times New Roman" w:hAnsi="Times New Roman" w:cs="Times New Roman"/>
-          <w:b/>
-          <w:sz w:val="24"/>
-        </w:rPr>
-        <w:t xml:space="preserve"> 2</w:t>
-      </w:r>
-      <w:r>
-        <w:rPr>
-          <w:rFonts w:ascii="Times New Roman" w:eastAsia="Times New Roman" w:hAnsi="Times New Roman" w:cs="Times New Roman"/>
-          <w:b/>
-          <w:sz w:val="24"/>
-          <w:vertAlign w:val="superscript"/>
-        </w:rPr>
-        <w:t>nd</w:t>
-      </w:r>
-      <w:r>
-        <w:rPr>
-          <w:rFonts w:ascii="Times New Roman" w:eastAsia="Times New Roman" w:hAnsi="Times New Roman" w:cs="Times New Roman"/>
-          <w:b/>
-          <w:sz w:val="24"/>
-        </w:rPr>
-        <w:t xml:space="preserve"> </w:t>
-      </w:r>
-      <w:proofErr w:type="gramStart"/>
-      <w:r>
-        <w:rPr>
-          <w:rFonts w:ascii="Times New Roman" w:eastAsia="Times New Roman" w:hAnsi="Times New Roman" w:cs="Times New Roman"/>
-          <w:b/>
-          <w:sz w:val="24"/>
-        </w:rPr>
-        <w:t xml:space="preserve">   (  )</w:t>
-      </w:r>
-      <w:proofErr w:type="gramEnd"/>
-      <w:r>
-        <w:rPr>
-          <w:rFonts w:ascii="Times New Roman" w:eastAsia="Times New Roman" w:hAnsi="Times New Roman" w:cs="Times New Roman"/>
-          <w:b/>
-          <w:sz w:val="24"/>
-        </w:rPr>
-        <w:t xml:space="preserve"> 3</w:t>
-      </w:r>
-      <w:r>
-        <w:rPr>
-          <w:rFonts w:ascii="Times New Roman" w:eastAsia="Times New Roman" w:hAnsi="Times New Roman" w:cs="Times New Roman"/>
-          <w:b/>
-          <w:sz w:val="24"/>
-          <w:vertAlign w:val="superscript"/>
-        </w:rPr>
-        <w:t>rd</w:t>
-      </w:r>
-      <w:r>
-        <w:rPr>
-          <w:rFonts w:ascii="Times New Roman" w:eastAsia="Times New Roman" w:hAnsi="Times New Roman" w:cs="Times New Roman"/>
-          <w:b/>
-          <w:sz w:val="24"/>
-        </w:rPr>
-        <w:t xml:space="preserve"> </w:t>
-      </w:r>
-    </w:p>
-    <w:p>
-      <w:pPr>
-        <w:spacing w:after="263"/>
-        <w:ind w:left="650" w:hanging="10"/>
-        <w:rPr>
-          <w:rFonts w:ascii="Times New Roman" w:hAnsi="Times New Roman" w:cs="Times New Roman"/>
-        </w:rPr>
-      </w:pPr>
-      <w:r>
-        <w:rPr>
-          <w:rFonts w:ascii="Times New Roman" w:eastAsia="Times New Roman" w:hAnsi="Times New Roman" w:cs="Times New Roman"/>
-          <w:sz w:val="24"/>
-        </w:rPr>
-        <w:t xml:space="preserve">Date/Time &amp; Venue: </w:t>
-      </w:r>
-      <w:r>
-        <w:rPr>
-          <w:rFonts w:ascii="Times New Roman" w:eastAsia="Times New Roman" w:hAnsi="Times New Roman" w:cs="Times New Roman"/>
-          <w:b/>
-          <w:sz w:val="24"/>
-        </w:rPr>
-        <w:t xml:space="preserve">April 15, </w:t>
-      </w:r>
-      <w:proofErr w:type="gramStart"/>
-      <w:r>
-        <w:rPr>
-          <w:rFonts w:ascii="Times New Roman" w:eastAsia="Times New Roman" w:hAnsi="Times New Roman" w:cs="Times New Roman"/>
-          <w:b/>
-          <w:sz w:val="24"/>
-        </w:rPr>
-        <w:t>2026</w:t>
-      </w:r>
-      <w:proofErr w:type="gramEnd"/>
-      <w:r>
-        <w:rPr>
-          <w:rFonts w:ascii="Times New Roman" w:eastAsia="Times New Roman" w:hAnsi="Times New Roman" w:cs="Times New Roman"/>
-          <w:b/>
-          <w:sz w:val="24"/>
-        </w:rPr>
-        <w:t xml:space="preserve"> || 2:00pm || IT Faculty Room</w:t>
-      </w:r>
-    </w:p>
-    <w:p>
-      <w:pPr>
-        <w:tabs>
-          <w:tab w:val="center" w:pos="2356"/>
-          <w:tab w:val="center" w:pos="4240"/>
-        </w:tabs>
-        <w:spacing w:after="208"/>
-        <w:rPr>
-          <w:rFonts w:ascii="Times New Roman" w:hAnsi="Times New Roman" w:cs="Times New Roman"/>
-        </w:rPr>
-      </w:pPr>
-      <w:r>
-        <w:rPr>
-          <w:rFonts w:ascii="Times New Roman" w:hAnsi="Times New Roman" w:cs="Times New Roman"/>
-        </w:rPr>
-        <w:tab/>
-      </w:r>
-      <w:r>
-        <w:rPr>
-          <w:rFonts w:ascii="Times New Roman" w:eastAsia="Times New Roman" w:hAnsi="Times New Roman" w:cs="Times New Roman"/>
-          <w:sz w:val="24"/>
-        </w:rPr>
-        <w:t>Adviser:</w:t>
-      </w:r>
-      <w:r>
-        <w:rPr>
-          <w:rFonts w:ascii="Times New Roman" w:eastAsia="Times New Roman" w:hAnsi="Times New Roman" w:cs="Times New Roman"/>
-          <w:b/>
-          <w:sz w:val="24"/>
-        </w:rPr>
-        <w:t xml:space="preserve"> Peter Joseph G. Rabanes</w:t>
-      </w:r>
-      <w:r>
-        <w:rPr>
-          <w:rFonts w:ascii="Times New Roman" w:eastAsia="Cambria" w:hAnsi="Times New Roman" w:cs="Times New Roman"/>
-          <w:sz w:val="24"/>
-        </w:rPr>
-        <w:tab/>
-      </w:r>
-      <w:r>
-        <w:rPr>
-          <w:rFonts w:ascii="Times New Roman" w:eastAsia="Cambria" w:hAnsi="Times New Roman" w:cs="Times New Roman"/>
-          <w:sz w:val="24"/>
-        </w:rPr>
-        <w:tab/>
-      </w:r>
-      <w:r>
-        <w:rPr>
-          <w:rFonts w:ascii="Times New Roman" w:eastAsia="Cambria" w:hAnsi="Times New Roman" w:cs="Times New Roman"/>
-          <w:sz w:val="24"/>
-        </w:rPr>
-        <w:tab/>
-      </w:r>
-    </w:p>
-    <w:p>
-      <w:pPr>
-        <w:spacing w:after="115" w:line="441" w:lineRule="auto"/>
-        <w:ind w:left="635" w:right="4297" w:hanging="10"/>
-        <w:rPr>
-          <w:rFonts w:ascii="Times New Roman" w:hAnsi="Times New Roman" w:cs="Times New Roman"/>
-        </w:rPr>
-      </w:pPr>
-      <w:r>
-        <w:rPr>
-          <w:rFonts w:ascii="Times New Roman" w:eastAsia="Times New Roman" w:hAnsi="Times New Roman" w:cs="Times New Roman"/>
-          <w:sz w:val="24"/>
-        </w:rPr>
-        <w:t>Panel Chair/REC:</w:t>
-      </w:r>
-      <w:r>
-        <w:rPr>
-          <w:rFonts w:ascii="Times New Roman" w:eastAsia="Times New Roman" w:hAnsi="Times New Roman" w:cs="Times New Roman"/>
-          <w:b/>
-          <w:sz w:val="24"/>
-        </w:rPr>
-        <w:t xml:space="preserve"> Dr. Rozanne Tuesday G. Flores </w:t>
-      </w:r>
-      <w:r>
-        <w:rPr>
-          <w:rFonts w:ascii="Times New Roman" w:eastAsia="Times New Roman" w:hAnsi="Times New Roman" w:cs="Times New Roman"/>
-          <w:sz w:val="24"/>
-        </w:rPr>
-        <w:t xml:space="preserve">Panel Members: </w:t>
-      </w:r>
-    </w:p>
-    <w:p>
-      <w:pPr>
-        <w:spacing w:after="176"/>
-        <w:ind w:left="1373" w:hanging="10"/>
-        <w:rPr>
-          <w:rFonts w:ascii="Times New Roman" w:hAnsi="Times New Roman" w:cs="Times New Roman"/>
-        </w:rPr>
-      </w:pPr>
-      <w:r>
-        <w:rPr>
-          <w:rFonts w:ascii="Times New Roman" w:eastAsia="Times New Roman" w:hAnsi="Times New Roman" w:cs="Times New Roman"/>
-          <w:b/>
-          <w:sz w:val="24"/>
-        </w:rPr>
-        <w:t>Anna Rose C. Tan</w:t>
-      </w:r>
-    </w:p>
-    <w:p>
-      <w:pPr>
-        <w:spacing w:after="244"/>
-        <w:ind w:left="1373" w:hanging="10"/>
-        <w:rPr>
-          <w:rFonts w:ascii="Times New Roman" w:hAnsi="Times New Roman" w:cs="Times New Roman"/>
-        </w:rPr>
-      </w:pPr>
-      <w:r>
-        <w:rPr>
-          <w:rFonts w:ascii="Times New Roman" w:eastAsia="Times New Roman" w:hAnsi="Times New Roman" w:cs="Times New Roman"/>
-          <w:b/>
-          <w:sz w:val="24"/>
-        </w:rPr>
-        <w:t>Roanne Zoe Cayanan</w:t>
-      </w:r>
     </w:p>
     <w:p>
       <w:pPr>
@@ -562,64 +118,13 @@
         <w:ind w:left="640"/>
         <w:rPr>
           <w:rFonts w:ascii="Times New Roman" w:hAnsi="Times New Roman" w:cs="Times New Roman"/>
+          <w:szCs w:val="22"/>
         </w:rPr>
       </w:pPr>
       <w:r>
         <w:rPr>
-          <w:rFonts w:ascii="Times New Roman" w:eastAsia="Times New Roman" w:hAnsi="Times New Roman" w:cs="Times New Roman"/>
-          <w:sz w:val="24"/>
-        </w:rPr>
-        <w:t>Secretary:</w:t>
-      </w:r>
-      <w:r>
-        <w:rPr>
-          <w:rFonts w:ascii="Times New Roman" w:eastAsia="Times New Roman" w:hAnsi="Times New Roman" w:cs="Times New Roman"/>
-          <w:b/>
-          <w:sz w:val="24"/>
-        </w:rPr>
-        <w:t xml:space="preserve"> </w:t>
-      </w:r>
-      <w:proofErr w:type="spellStart"/>
-      <w:r>
-        <w:rPr>
-          <w:rFonts w:ascii="Times New Roman" w:eastAsia="Cambria" w:hAnsi="Times New Roman" w:cs="Times New Roman"/>
-          <w:b/>
-          <w:sz w:val="24"/>
-        </w:rPr>
-        <w:t>Czarissa</w:t>
-      </w:r>
-      <w:proofErr w:type="spellEnd"/>
-      <w:r>
-        <w:rPr>
-          <w:rFonts w:ascii="Times New Roman" w:eastAsia="Cambria" w:hAnsi="Times New Roman" w:cs="Times New Roman"/>
-          <w:b/>
-          <w:sz w:val="24"/>
-        </w:rPr>
-        <w:tab/>
-        <w:t>Louise</w:t>
-      </w:r>
-      <w:r>
-        <w:rPr>
-          <w:rFonts w:ascii="Times New Roman" w:eastAsia="Cambria" w:hAnsi="Times New Roman" w:cs="Times New Roman"/>
-          <w:b/>
-          <w:sz w:val="24"/>
-        </w:rPr>
-        <w:tab/>
-        <w:t>A.</w:t>
-      </w:r>
-      <w:r>
-        <w:rPr>
-          <w:rFonts w:ascii="Times New Roman" w:eastAsia="Cambria" w:hAnsi="Times New Roman" w:cs="Times New Roman"/>
-          <w:b/>
-          <w:sz w:val="24"/>
-        </w:rPr>
-        <w:tab/>
-        <w:t>Navidad</w:t>
-      </w:r>
-      <w:r>
-        <w:rPr>
-          <w:rFonts w:ascii="Times New Roman" w:eastAsia="Cambria" w:hAnsi="Times New Roman" w:cs="Times New Roman"/>
-          <w:sz w:val="24"/>
+          <w:rFonts w:ascii="Times New Roman" w:hAnsi="Times New Roman" w:cs="Times New Roman"/>
+          <w:szCs w:val="22"/>
         </w:rPr>
         <w:tab/>
       </w:r>
@@ -639,8 +144,6 @@
         </w:tblBorders>
         <w:tblCellMar>
           <w:top w:w="17" w:type="dxa"/>
-          <w:left w:w="0" w:type="dxa"/>
-          <w:bottom w:w="0" w:type="dxa"/>
           <w:right w:w="115" w:type="dxa"/>
         </w:tblCellMar>
         <w:tblLook w:val="04A0" w:firstRow="1" w:lastRow="0" w:firstColumn="1" w:lastColumn="0" w:noHBand="0" w:noVBand="1"/>
@@ -657,21 +160,105 @@
         </w:trPr>
         <w:tc>
           <w:tcPr>
-            <w:tcW w:w="1778" w:type="dxa"/>
-          </w:tcPr>
-          <w:p>
-            <w:pPr>
-              <w:spacing w:after="0"/>
+            <w:tcW w:w="10260" w:type="dxa"/>
+            <w:gridSpan w:val="4"/>
+          </w:tcPr>
+          <w:p>
+            <w:pPr>
+              <w:rPr>
+                <w:rFonts w:ascii="Times New Roman" w:eastAsia="Times New Roman" w:hAnsi="Times New Roman" w:cs="Times New Roman"/>
+                <w:b/>
+                <w:szCs w:val="22"/>
+              </w:rPr>
+            </w:pPr>
+            <w:r>
+              <w:rPr>
+                <w:rFonts w:ascii="Times New Roman" w:eastAsia="Times New Roman" w:hAnsi="Times New Roman" w:cs="Times New Roman"/>
+                <w:b/>
+                <w:bCs/>
+                <w:szCs w:val="22"/>
+              </w:rPr>
+              <w:t>T</w:t>
+            </w:r>
+            <w:r>
+              <w:rPr>
+                <w:rFonts w:ascii="Times New Roman" w:eastAsia="Times New Roman" w:hAnsi="Times New Roman" w:cs="Times New Roman"/>
+                <w:b/>
+                <w:bCs/>
+                <w:szCs w:val="22"/>
+              </w:rPr>
+              <w:t>ype of Review</w:t>
+            </w:r>
+            <w:proofErr w:type="gramStart"/>
+            <w:r>
+              <w:rPr>
+                <w:rFonts w:ascii="Times New Roman" w:eastAsia="Times New Roman" w:hAnsi="Times New Roman" w:cs="Times New Roman"/>
+                <w:b/>
+                <w:szCs w:val="22"/>
+              </w:rPr>
+              <w:t>:  (</w:t>
+            </w:r>
+            <w:proofErr w:type="gramEnd"/>
+            <w:r>
+              <w:rPr>
+                <w:rFonts w:ascii="Times New Roman" w:eastAsia="Times New Roman" w:hAnsi="Times New Roman" w:cs="Times New Roman"/>
+                <w:b/>
+                <w:szCs w:val="22"/>
+              </w:rPr>
+              <w:t xml:space="preserve">Please </w:t>
+            </w:r>
+            <w:proofErr w:type="gramStart"/>
+            <w:r>
+              <w:rPr>
+                <w:rFonts w:ascii="Times New Roman" w:eastAsia="Times New Roman" w:hAnsi="Times New Roman" w:cs="Times New Roman"/>
+                <w:b/>
+                <w:szCs w:val="22"/>
+              </w:rPr>
+              <w:t>tick)   </w:t>
+            </w:r>
+            <w:proofErr w:type="gramEnd"/>
+            <w:r>
+              <w:rPr>
+                <w:rFonts w:ascii="Times New Roman" w:eastAsia="Times New Roman" w:hAnsi="Times New Roman" w:cs="Times New Roman"/>
+                <w:b/>
+                <w:szCs w:val="22"/>
+              </w:rPr>
+              <w:t xml:space="preserve">         Internal Review                          External Review</w:t>
+            </w:r>
+          </w:p>
+          <w:p>
+            <w:pPr>
+              <w:ind w:left="1323"/>
+              <w:rPr>
+                <w:rFonts w:ascii="Times New Roman" w:eastAsia="Times New Roman" w:hAnsi="Times New Roman" w:cs="Times New Roman"/>
+                <w:b/>
+                <w:szCs w:val="22"/>
+              </w:rPr>
+            </w:pPr>
+          </w:p>
+        </w:tc>
+      </w:tr>
+      <w:tr>
+        <w:trPr>
+          <w:trHeight w:val="530"/>
+        </w:trPr>
+        <w:tc>
+          <w:tcPr>
+            <w:tcW w:w="1743" w:type="dxa"/>
+          </w:tcPr>
+          <w:p>
+            <w:pPr>
               <w:ind w:left="351"/>
               <w:rPr>
                 <w:rFonts w:ascii="Times New Roman" w:hAnsi="Times New Roman" w:cs="Times New Roman"/>
+                <w:szCs w:val="22"/>
               </w:rPr>
             </w:pPr>
             <w:r>
               <w:rPr>
                 <w:rFonts w:ascii="Times New Roman" w:eastAsia="Times New Roman" w:hAnsi="Times New Roman" w:cs="Times New Roman"/>
                 <w:b/>
-                <w:sz w:val="24"/>
+                <w:szCs w:val="22"/>
               </w:rPr>
               <w:t>Name of Panel</w:t>
             </w:r>
@@ -679,32 +266,33 @@
         </w:tc>
         <w:tc>
           <w:tcPr>
-            <w:tcW w:w="375" w:type="dxa"/>
-          </w:tcPr>
-          <w:p>
-            <w:pPr>
-              <w:rPr>
-                <w:rFonts w:ascii="Times New Roman" w:hAnsi="Times New Roman" w:cs="Times New Roman"/>
-              </w:rPr>
-            </w:pPr>
-          </w:p>
-        </w:tc>
-        <w:tc>
-          <w:tcPr>
-            <w:tcW w:w="4513" w:type="dxa"/>
-          </w:tcPr>
-          <w:p>
-            <w:pPr>
-              <w:spacing w:after="0"/>
-              <w:rPr>
-                <w:rFonts w:ascii="Times New Roman" w:hAnsi="Times New Roman" w:cs="Times New Roman"/>
+            <w:tcW w:w="384" w:type="dxa"/>
+          </w:tcPr>
+          <w:p>
+            <w:pPr>
+              <w:rPr>
+                <w:rFonts w:ascii="Times New Roman" w:hAnsi="Times New Roman" w:cs="Times New Roman"/>
+                <w:szCs w:val="22"/>
+              </w:rPr>
+            </w:pPr>
+          </w:p>
+        </w:tc>
+        <w:tc>
+          <w:tcPr>
+            <w:tcW w:w="4418" w:type="dxa"/>
+          </w:tcPr>
+          <w:p>
+            <w:pPr>
+              <w:rPr>
+                <w:rFonts w:ascii="Times New Roman" w:hAnsi="Times New Roman" w:cs="Times New Roman"/>
+                <w:szCs w:val="22"/>
               </w:rPr>
             </w:pPr>
             <w:r>
               <w:rPr>
                 <w:rFonts w:ascii="Times New Roman" w:eastAsia="Times New Roman" w:hAnsi="Times New Roman" w:cs="Times New Roman"/>
                 <w:b/>
-                <w:sz w:val="24"/>
+                <w:szCs w:val="22"/>
               </w:rPr>
               <w:t>COMMENTS/SUGGESTIONS</w:t>
             </w:r>
@@ -712,18 +300,25 @@
         </w:tc>
         <w:tc>
           <w:tcPr>
-            <w:tcW w:w="3594" w:type="dxa"/>
-          </w:tcPr>
-          <w:p>
-            <w:pPr>
-              <w:spacing w:after="0"/>
+            <w:tcW w:w="3715" w:type="dxa"/>
+          </w:tcPr>
+          <w:p>
+            <w:pPr>
               <w:ind w:left="1323"/>
               <w:rPr>
                 <w:rFonts w:ascii="Times New Roman" w:eastAsia="Times New Roman" w:hAnsi="Times New Roman" w:cs="Times New Roman"/>
                 <w:b/>
-                <w:sz w:val="24"/>
-              </w:rPr>
-            </w:pPr>
+                <w:szCs w:val="22"/>
+              </w:rPr>
+            </w:pPr>
+            <w:r>
+              <w:rPr>
+                <w:rFonts w:ascii="Times New Roman" w:eastAsia="Times New Roman" w:hAnsi="Times New Roman" w:cs="Times New Roman"/>
+                <w:b/>
+                <w:szCs w:val="22"/>
+              </w:rPr>
+              <w:t>ACTION TAKEN</w:t>
+            </w:r>
           </w:p>
         </w:tc>
       </w:tr>
@@ -733,21 +328,21 @@
         </w:trPr>
         <w:tc>
           <w:tcPr>
-            <w:tcW w:w="1778" w:type="dxa"/>
-          </w:tcPr>
-          <w:p>
-            <w:pPr>
-              <w:spacing w:after="0"/>
+            <w:tcW w:w="1743" w:type="dxa"/>
+          </w:tcPr>
+          <w:p>
+            <w:pPr>
               <w:ind w:left="345"/>
               <w:rPr>
                 <w:rFonts w:ascii="Times New Roman" w:hAnsi="Times New Roman" w:cs="Times New Roman"/>
+                <w:szCs w:val="22"/>
               </w:rPr>
             </w:pPr>
             <w:r>
               <w:rPr>
                 <w:rFonts w:ascii="Times New Roman" w:eastAsia="Times New Roman" w:hAnsi="Times New Roman" w:cs="Times New Roman"/>
                 <w:b/>
-                <w:sz w:val="24"/>
+                <w:szCs w:val="22"/>
               </w:rPr>
               <w:t>Dr. Rozanne Tuesday G. Flores</w:t>
             </w:r>
@@ -755,21 +350,21 @@
         </w:tc>
         <w:tc>
           <w:tcPr>
-            <w:tcW w:w="375" w:type="dxa"/>
-          </w:tcPr>
-          <w:p>
-            <w:pPr>
-              <w:spacing w:after="0"/>
+            <w:tcW w:w="384" w:type="dxa"/>
+          </w:tcPr>
+          <w:p>
+            <w:pPr>
               <w:ind w:left="184"/>
               <w:jc w:val="center"/>
               <w:rPr>
                 <w:rFonts w:ascii="Times New Roman" w:hAnsi="Times New Roman" w:cs="Times New Roman"/>
-              </w:rPr>
-            </w:pPr>
-            <w:r>
-              <w:rPr>
-                <w:rFonts w:ascii="Times New Roman" w:eastAsia="Times New Roman" w:hAnsi="Times New Roman" w:cs="Times New Roman"/>
-                <w:sz w:val="24"/>
+                <w:szCs w:val="22"/>
+              </w:rPr>
+            </w:pPr>
+            <w:r>
+              <w:rPr>
+                <w:rFonts w:ascii="Times New Roman" w:eastAsia="Times New Roman" w:hAnsi="Times New Roman" w:cs="Times New Roman"/>
+                <w:szCs w:val="22"/>
               </w:rPr>
               <w:t>•</w:t>
             </w:r>
@@ -777,19 +372,19 @@
         </w:tc>
         <w:tc>
           <w:tcPr>
-            <w:tcW w:w="4513" w:type="dxa"/>
-          </w:tcPr>
-          <w:p>
-            <w:pPr>
-              <w:spacing w:after="0"/>
-              <w:rPr>
-                <w:rFonts w:ascii="Times New Roman" w:hAnsi="Times New Roman" w:cs="Times New Roman"/>
-              </w:rPr>
-            </w:pPr>
-            <w:r>
-              <w:rPr>
-                <w:rFonts w:ascii="Times New Roman" w:eastAsia="Times New Roman" w:hAnsi="Times New Roman" w:cs="Times New Roman"/>
-                <w:sz w:val="24"/>
+            <w:tcW w:w="4418" w:type="dxa"/>
+          </w:tcPr>
+          <w:p>
+            <w:pPr>
+              <w:rPr>
+                <w:rFonts w:ascii="Times New Roman" w:hAnsi="Times New Roman" w:cs="Times New Roman"/>
+                <w:szCs w:val="22"/>
+              </w:rPr>
+            </w:pPr>
+            <w:r>
+              <w:rPr>
+                <w:rFonts w:ascii="Times New Roman" w:eastAsia="Times New Roman" w:hAnsi="Times New Roman" w:cs="Times New Roman"/>
+                <w:szCs w:val="22"/>
               </w:rPr>
               <w:t xml:space="preserve">Expand locations for testing, use locations with more frequent traffic. </w:t>
             </w:r>
@@ -797,52 +392,49 @@
         </w:tc>
         <w:tc>
           <w:tcPr>
-            <w:tcW w:w="3594" w:type="dxa"/>
-          </w:tcPr>
-          <w:p>
-            <w:pPr>
-              <w:spacing w:after="0"/>
-              <w:rPr>
-                <w:rFonts w:ascii="Times New Roman" w:eastAsia="Times New Roman" w:hAnsi="Times New Roman" w:cs="Times New Roman"/>
-                <w:sz w:val="24"/>
-              </w:rPr>
-            </w:pPr>
-            <w:r>
-              <w:rPr>
-                <w:rFonts w:ascii="Times New Roman" w:eastAsia="Times New Roman" w:hAnsi="Times New Roman" w:cs="Times New Roman"/>
-                <w:sz w:val="24"/>
+            <w:tcW w:w="3715" w:type="dxa"/>
+          </w:tcPr>
+          <w:p>
+            <w:pPr>
+              <w:rPr>
+                <w:rFonts w:ascii="Times New Roman" w:eastAsia="Times New Roman" w:hAnsi="Times New Roman" w:cs="Times New Roman"/>
+                <w:szCs w:val="22"/>
+              </w:rPr>
+            </w:pPr>
+            <w:r>
+              <w:rPr>
+                <w:rFonts w:ascii="Times New Roman" w:eastAsia="Times New Roman" w:hAnsi="Times New Roman" w:cs="Times New Roman"/>
+                <w:szCs w:val="22"/>
               </w:rPr>
               <w:t>Location</w:t>
             </w:r>
           </w:p>
           <w:p>
             <w:pPr>
-              <w:spacing w:after="0"/>
-              <w:rPr>
-                <w:rFonts w:ascii="Times New Roman" w:eastAsia="Times New Roman" w:hAnsi="Times New Roman" w:cs="Times New Roman"/>
-                <w:sz w:val="24"/>
-              </w:rPr>
-            </w:pPr>
-          </w:p>
-          <w:p>
-            <w:pPr>
-              <w:spacing w:after="0"/>
-              <w:rPr>
-                <w:rFonts w:ascii="Times New Roman" w:eastAsia="Times New Roman" w:hAnsi="Times New Roman" w:cs="Times New Roman"/>
-                <w:sz w:val="24"/>
-              </w:rPr>
-            </w:pPr>
-            <w:r>
-              <w:rPr>
-                <w:rFonts w:ascii="Times New Roman" w:eastAsia="Times New Roman" w:hAnsi="Times New Roman" w:cs="Times New Roman"/>
-                <w:sz w:val="24"/>
+              <w:rPr>
+                <w:rFonts w:ascii="Times New Roman" w:eastAsia="Times New Roman" w:hAnsi="Times New Roman" w:cs="Times New Roman"/>
+                <w:szCs w:val="22"/>
+              </w:rPr>
+            </w:pPr>
+          </w:p>
+          <w:p>
+            <w:pPr>
+              <w:rPr>
+                <w:rFonts w:ascii="Times New Roman" w:eastAsia="Times New Roman" w:hAnsi="Times New Roman" w:cs="Times New Roman"/>
+                <w:szCs w:val="22"/>
+              </w:rPr>
+            </w:pPr>
+            <w:r>
+              <w:rPr>
+                <w:rFonts w:ascii="Times New Roman" w:eastAsia="Times New Roman" w:hAnsi="Times New Roman" w:cs="Times New Roman"/>
+                <w:szCs w:val="22"/>
               </w:rPr>
               <w:t>Sayre Highway - Fortich St., Malaybalay City</w:t>
             </w:r>
             <w:r>
               <w:rPr>
                 <w:rFonts w:ascii="Times New Roman" w:eastAsia="Times New Roman" w:hAnsi="Times New Roman" w:cs="Times New Roman"/>
-                <w:sz w:val="24"/>
+                <w:szCs w:val="22"/>
               </w:rPr>
               <w:br/>
             </w:r>
@@ -855,33 +447,34 @@
         </w:trPr>
         <w:tc>
           <w:tcPr>
-            <w:tcW w:w="1778" w:type="dxa"/>
-          </w:tcPr>
-          <w:p>
-            <w:pPr>
-              <w:rPr>
-                <w:rFonts w:ascii="Times New Roman" w:hAnsi="Times New Roman" w:cs="Times New Roman"/>
-              </w:rPr>
-            </w:pPr>
-          </w:p>
-        </w:tc>
-        <w:tc>
-          <w:tcPr>
-            <w:tcW w:w="375" w:type="dxa"/>
-          </w:tcPr>
-          <w:p>
-            <w:pPr>
-              <w:spacing w:after="0"/>
+            <w:tcW w:w="1743" w:type="dxa"/>
+          </w:tcPr>
+          <w:p>
+            <w:pPr>
+              <w:rPr>
+                <w:rFonts w:ascii="Times New Roman" w:hAnsi="Times New Roman" w:cs="Times New Roman"/>
+                <w:szCs w:val="22"/>
+              </w:rPr>
+            </w:pPr>
+          </w:p>
+        </w:tc>
+        <w:tc>
+          <w:tcPr>
+            <w:tcW w:w="384" w:type="dxa"/>
+          </w:tcPr>
+          <w:p>
+            <w:pPr>
               <w:ind w:left="184"/>
               <w:jc w:val="center"/>
               <w:rPr>
                 <w:rFonts w:ascii="Times New Roman" w:hAnsi="Times New Roman" w:cs="Times New Roman"/>
-              </w:rPr>
-            </w:pPr>
-            <w:r>
-              <w:rPr>
-                <w:rFonts w:ascii="Times New Roman" w:eastAsia="Times New Roman" w:hAnsi="Times New Roman" w:cs="Times New Roman"/>
-                <w:sz w:val="24"/>
+                <w:szCs w:val="22"/>
+              </w:rPr>
+            </w:pPr>
+            <w:r>
+              <w:rPr>
+                <w:rFonts w:ascii="Times New Roman" w:eastAsia="Times New Roman" w:hAnsi="Times New Roman" w:cs="Times New Roman"/>
+                <w:szCs w:val="22"/>
               </w:rPr>
               <w:t>•</w:t>
             </w:r>
@@ -889,19 +482,19 @@
         </w:tc>
         <w:tc>
           <w:tcPr>
-            <w:tcW w:w="4513" w:type="dxa"/>
-          </w:tcPr>
-          <w:p>
-            <w:pPr>
-              <w:spacing w:after="0"/>
-              <w:rPr>
-                <w:rFonts w:ascii="Times New Roman" w:hAnsi="Times New Roman" w:cs="Times New Roman"/>
-              </w:rPr>
-            </w:pPr>
-            <w:r>
-              <w:rPr>
-                <w:rFonts w:ascii="Times New Roman" w:eastAsia="Times New Roman" w:hAnsi="Times New Roman" w:cs="Times New Roman"/>
-                <w:sz w:val="24"/>
+            <w:tcW w:w="4418" w:type="dxa"/>
+          </w:tcPr>
+          <w:p>
+            <w:pPr>
+              <w:rPr>
+                <w:rFonts w:ascii="Times New Roman" w:hAnsi="Times New Roman" w:cs="Times New Roman"/>
+                <w:szCs w:val="22"/>
+              </w:rPr>
+            </w:pPr>
+            <w:r>
+              <w:rPr>
+                <w:rFonts w:ascii="Times New Roman" w:eastAsia="Times New Roman" w:hAnsi="Times New Roman" w:cs="Times New Roman"/>
+                <w:szCs w:val="22"/>
               </w:rPr>
               <w:t xml:space="preserve">Reports should not be static. Allow generation of custom dates. </w:t>
             </w:r>
@@ -909,20 +502,20 @@
         </w:tc>
         <w:tc>
           <w:tcPr>
-            <w:tcW w:w="3594" w:type="dxa"/>
-          </w:tcPr>
-          <w:p>
-            <w:pPr>
-              <w:spacing w:after="0"/>
-              <w:rPr>
-                <w:rFonts w:ascii="Times New Roman" w:eastAsia="Times New Roman" w:hAnsi="Times New Roman" w:cs="Times New Roman"/>
-                <w:sz w:val="24"/>
-              </w:rPr>
-            </w:pPr>
-            <w:r>
-              <w:rPr>
-                <w:rFonts w:ascii="Times New Roman" w:eastAsia="Times New Roman" w:hAnsi="Times New Roman" w:cs="Times New Roman"/>
-                <w:sz w:val="24"/>
+            <w:tcW w:w="3715" w:type="dxa"/>
+          </w:tcPr>
+          <w:p>
+            <w:pPr>
+              <w:rPr>
+                <w:rFonts w:ascii="Times New Roman" w:eastAsia="Times New Roman" w:hAnsi="Times New Roman" w:cs="Times New Roman"/>
+                <w:szCs w:val="22"/>
+              </w:rPr>
+            </w:pPr>
+            <w:r>
+              <w:rPr>
+                <w:rFonts w:ascii="Times New Roman" w:eastAsia="Times New Roman" w:hAnsi="Times New Roman" w:cs="Times New Roman"/>
+                <w:noProof/>
+                <w:szCs w:val="22"/>
               </w:rPr>
               <w:drawing>
                 <wp:inline distT="0" distB="0" distL="0" distR="0" wp14:anchorId="66AA6A97" wp14:editId="27A66F01">
@@ -969,33 +562,34 @@
         </w:trPr>
         <w:tc>
           <w:tcPr>
-            <w:tcW w:w="1778" w:type="dxa"/>
-          </w:tcPr>
-          <w:p>
-            <w:pPr>
-              <w:rPr>
-                <w:rFonts w:ascii="Times New Roman" w:hAnsi="Times New Roman" w:cs="Times New Roman"/>
-              </w:rPr>
-            </w:pPr>
-          </w:p>
-        </w:tc>
-        <w:tc>
-          <w:tcPr>
-            <w:tcW w:w="375" w:type="dxa"/>
-          </w:tcPr>
-          <w:p>
-            <w:pPr>
-              <w:spacing w:after="0"/>
+            <w:tcW w:w="1743" w:type="dxa"/>
+          </w:tcPr>
+          <w:p>
+            <w:pPr>
+              <w:rPr>
+                <w:rFonts w:ascii="Times New Roman" w:hAnsi="Times New Roman" w:cs="Times New Roman"/>
+                <w:szCs w:val="22"/>
+              </w:rPr>
+            </w:pPr>
+          </w:p>
+        </w:tc>
+        <w:tc>
+          <w:tcPr>
+            <w:tcW w:w="384" w:type="dxa"/>
+          </w:tcPr>
+          <w:p>
+            <w:pPr>
               <w:ind w:left="184"/>
               <w:jc w:val="center"/>
               <w:rPr>
                 <w:rFonts w:ascii="Times New Roman" w:hAnsi="Times New Roman" w:cs="Times New Roman"/>
-              </w:rPr>
-            </w:pPr>
-            <w:r>
-              <w:rPr>
-                <w:rFonts w:ascii="Times New Roman" w:eastAsia="Times New Roman" w:hAnsi="Times New Roman" w:cs="Times New Roman"/>
-                <w:sz w:val="24"/>
+                <w:szCs w:val="22"/>
+              </w:rPr>
+            </w:pPr>
+            <w:r>
+              <w:rPr>
+                <w:rFonts w:ascii="Times New Roman" w:eastAsia="Times New Roman" w:hAnsi="Times New Roman" w:cs="Times New Roman"/>
+                <w:szCs w:val="22"/>
               </w:rPr>
               <w:t>•</w:t>
             </w:r>
@@ -1003,19 +597,19 @@
         </w:tc>
         <w:tc>
           <w:tcPr>
-            <w:tcW w:w="4513" w:type="dxa"/>
-          </w:tcPr>
-          <w:p>
-            <w:pPr>
-              <w:spacing w:after="0"/>
-              <w:rPr>
-                <w:rFonts w:ascii="Times New Roman" w:hAnsi="Times New Roman" w:cs="Times New Roman"/>
-              </w:rPr>
-            </w:pPr>
-            <w:r>
-              <w:rPr>
-                <w:rFonts w:ascii="Times New Roman" w:eastAsia="Times New Roman" w:hAnsi="Times New Roman" w:cs="Times New Roman"/>
-                <w:sz w:val="24"/>
+            <w:tcW w:w="4418" w:type="dxa"/>
+          </w:tcPr>
+          <w:p>
+            <w:pPr>
+              <w:rPr>
+                <w:rFonts w:ascii="Times New Roman" w:hAnsi="Times New Roman" w:cs="Times New Roman"/>
+                <w:szCs w:val="22"/>
+              </w:rPr>
+            </w:pPr>
+            <w:r>
+              <w:rPr>
+                <w:rFonts w:ascii="Times New Roman" w:eastAsia="Times New Roman" w:hAnsi="Times New Roman" w:cs="Times New Roman"/>
+                <w:szCs w:val="22"/>
               </w:rPr>
               <w:t xml:space="preserve">Improve report generation file. Make sure it can be used by the client (TMC). Headers, signatories, etc. </w:t>
             </w:r>
@@ -1023,20 +617,20 @@
         </w:tc>
         <w:tc>
           <w:tcPr>
-            <w:tcW w:w="3594" w:type="dxa"/>
-          </w:tcPr>
-          <w:p>
-            <w:pPr>
-              <w:spacing w:after="0"/>
-              <w:rPr>
-                <w:rFonts w:ascii="Times New Roman" w:eastAsia="Times New Roman" w:hAnsi="Times New Roman" w:cs="Times New Roman"/>
-                <w:sz w:val="24"/>
-              </w:rPr>
-            </w:pPr>
-            <w:r>
-              <w:rPr>
-                <w:rFonts w:ascii="Times New Roman" w:eastAsia="Times New Roman" w:hAnsi="Times New Roman" w:cs="Times New Roman"/>
-                <w:sz w:val="24"/>
+            <w:tcW w:w="3715" w:type="dxa"/>
+          </w:tcPr>
+          <w:p>
+            <w:pPr>
+              <w:rPr>
+                <w:rFonts w:ascii="Times New Roman" w:eastAsia="Times New Roman" w:hAnsi="Times New Roman" w:cs="Times New Roman"/>
+                <w:szCs w:val="22"/>
+              </w:rPr>
+            </w:pPr>
+            <w:r>
+              <w:rPr>
+                <w:rFonts w:ascii="Times New Roman" w:eastAsia="Times New Roman" w:hAnsi="Times New Roman" w:cs="Times New Roman"/>
+                <w:noProof/>
+                <w:szCs w:val="22"/>
               </w:rPr>
               <w:drawing>
                 <wp:inline distT="0" distB="0" distL="0" distR="0" wp14:anchorId="24750D11" wp14:editId="27FB116C">
@@ -1083,33 +677,34 @@
         </w:trPr>
         <w:tc>
           <w:tcPr>
-            <w:tcW w:w="1778" w:type="dxa"/>
-          </w:tcPr>
-          <w:p>
-            <w:pPr>
-              <w:rPr>
-                <w:rFonts w:ascii="Times New Roman" w:hAnsi="Times New Roman" w:cs="Times New Roman"/>
-              </w:rPr>
-            </w:pPr>
-          </w:p>
-        </w:tc>
-        <w:tc>
-          <w:tcPr>
-            <w:tcW w:w="375" w:type="dxa"/>
-          </w:tcPr>
-          <w:p>
-            <w:pPr>
-              <w:spacing w:after="0"/>
+            <w:tcW w:w="1743" w:type="dxa"/>
+          </w:tcPr>
+          <w:p>
+            <w:pPr>
+              <w:rPr>
+                <w:rFonts w:ascii="Times New Roman" w:hAnsi="Times New Roman" w:cs="Times New Roman"/>
+                <w:szCs w:val="22"/>
+              </w:rPr>
+            </w:pPr>
+          </w:p>
+        </w:tc>
+        <w:tc>
+          <w:tcPr>
+            <w:tcW w:w="384" w:type="dxa"/>
+          </w:tcPr>
+          <w:p>
+            <w:pPr>
               <w:ind w:left="184"/>
               <w:jc w:val="center"/>
               <w:rPr>
                 <w:rFonts w:ascii="Times New Roman" w:hAnsi="Times New Roman" w:cs="Times New Roman"/>
-              </w:rPr>
-            </w:pPr>
-            <w:r>
-              <w:rPr>
-                <w:rFonts w:ascii="Times New Roman" w:eastAsia="Times New Roman" w:hAnsi="Times New Roman" w:cs="Times New Roman"/>
-                <w:sz w:val="24"/>
+                <w:szCs w:val="22"/>
+              </w:rPr>
+            </w:pPr>
+            <w:r>
+              <w:rPr>
+                <w:rFonts w:ascii="Times New Roman" w:eastAsia="Times New Roman" w:hAnsi="Times New Roman" w:cs="Times New Roman"/>
+                <w:szCs w:val="22"/>
               </w:rPr>
               <w:t>•</w:t>
             </w:r>
@@ -1117,34 +712,34 @@
         </w:tc>
         <w:tc>
           <w:tcPr>
-            <w:tcW w:w="4513" w:type="dxa"/>
-          </w:tcPr>
-          <w:p>
-            <w:pPr>
-              <w:spacing w:after="0"/>
-              <w:rPr>
-                <w:rFonts w:ascii="Times New Roman" w:hAnsi="Times New Roman" w:cs="Times New Roman"/>
-              </w:rPr>
-            </w:pPr>
-            <w:r>
-              <w:rPr>
-                <w:rFonts w:ascii="Times New Roman" w:eastAsia="Times New Roman" w:hAnsi="Times New Roman" w:cs="Times New Roman"/>
-                <w:sz w:val="24"/>
+            <w:tcW w:w="4418" w:type="dxa"/>
+          </w:tcPr>
+          <w:p>
+            <w:pPr>
+              <w:rPr>
+                <w:rFonts w:ascii="Times New Roman" w:hAnsi="Times New Roman" w:cs="Times New Roman"/>
+                <w:szCs w:val="22"/>
+              </w:rPr>
+            </w:pPr>
+            <w:r>
+              <w:rPr>
+                <w:rFonts w:ascii="Times New Roman" w:eastAsia="Times New Roman" w:hAnsi="Times New Roman" w:cs="Times New Roman"/>
+                <w:szCs w:val="22"/>
               </w:rPr>
               <w:t xml:space="preserve">Make sure the data that’s being recorded is useful and valuable. </w:t>
             </w:r>
           </w:p>
           <w:p>
             <w:pPr>
-              <w:spacing w:after="0"/>
-              <w:rPr>
-                <w:rFonts w:ascii="Times New Roman" w:hAnsi="Times New Roman" w:cs="Times New Roman"/>
-              </w:rPr>
-            </w:pPr>
-            <w:r>
-              <w:rPr>
-                <w:rFonts w:ascii="Times New Roman" w:eastAsia="Times New Roman" w:hAnsi="Times New Roman" w:cs="Times New Roman"/>
-                <w:sz w:val="24"/>
+              <w:rPr>
+                <w:rFonts w:ascii="Times New Roman" w:hAnsi="Times New Roman" w:cs="Times New Roman"/>
+                <w:szCs w:val="22"/>
+              </w:rPr>
+            </w:pPr>
+            <w:r>
+              <w:rPr>
+                <w:rFonts w:ascii="Times New Roman" w:eastAsia="Times New Roman" w:hAnsi="Times New Roman" w:cs="Times New Roman"/>
+                <w:szCs w:val="22"/>
               </w:rPr>
               <w:t xml:space="preserve">E.g. Location, Timestamp, Plate Number, Make/Color of Vehicle (picture, if possible). </w:t>
             </w:r>
@@ -1152,20 +747,20 @@
         </w:tc>
         <w:tc>
           <w:tcPr>
-            <w:tcW w:w="3594" w:type="dxa"/>
-          </w:tcPr>
-          <w:p>
-            <w:pPr>
-              <w:spacing w:after="0"/>
-              <w:rPr>
-                <w:rFonts w:ascii="Times New Roman" w:eastAsia="Times New Roman" w:hAnsi="Times New Roman" w:cs="Times New Roman"/>
-                <w:sz w:val="24"/>
-              </w:rPr>
-            </w:pPr>
-            <w:r>
-              <w:rPr>
-                <w:rFonts w:ascii="Times New Roman" w:eastAsia="Times New Roman" w:hAnsi="Times New Roman" w:cs="Times New Roman"/>
-                <w:sz w:val="24"/>
+            <w:tcW w:w="3715" w:type="dxa"/>
+          </w:tcPr>
+          <w:p>
+            <w:pPr>
+              <w:rPr>
+                <w:rFonts w:ascii="Times New Roman" w:eastAsia="Times New Roman" w:hAnsi="Times New Roman" w:cs="Times New Roman"/>
+                <w:szCs w:val="22"/>
+              </w:rPr>
+            </w:pPr>
+            <w:r>
+              <w:rPr>
+                <w:rFonts w:ascii="Times New Roman" w:eastAsia="Times New Roman" w:hAnsi="Times New Roman" w:cs="Times New Roman"/>
+                <w:noProof/>
+                <w:szCs w:val="22"/>
               </w:rPr>
               <w:drawing>
                 <wp:inline distT="0" distB="0" distL="0" distR="0" wp14:anchorId="786BB4FD" wp14:editId="30E9DE82">
@@ -1212,33 +807,34 @@
         </w:trPr>
         <w:tc>
           <w:tcPr>
-            <w:tcW w:w="1778" w:type="dxa"/>
-          </w:tcPr>
-          <w:p>
-            <w:pPr>
-              <w:rPr>
-                <w:rFonts w:ascii="Times New Roman" w:hAnsi="Times New Roman" w:cs="Times New Roman"/>
-              </w:rPr>
-            </w:pPr>
-          </w:p>
-        </w:tc>
-        <w:tc>
-          <w:tcPr>
-            <w:tcW w:w="375" w:type="dxa"/>
-          </w:tcPr>
-          <w:p>
-            <w:pPr>
-              <w:spacing w:after="0"/>
+            <w:tcW w:w="1743" w:type="dxa"/>
+          </w:tcPr>
+          <w:p>
+            <w:pPr>
+              <w:rPr>
+                <w:rFonts w:ascii="Times New Roman" w:hAnsi="Times New Roman" w:cs="Times New Roman"/>
+                <w:szCs w:val="22"/>
+              </w:rPr>
+            </w:pPr>
+          </w:p>
+        </w:tc>
+        <w:tc>
+          <w:tcPr>
+            <w:tcW w:w="384" w:type="dxa"/>
+          </w:tcPr>
+          <w:p>
+            <w:pPr>
               <w:ind w:left="184"/>
               <w:jc w:val="center"/>
               <w:rPr>
                 <w:rFonts w:ascii="Times New Roman" w:hAnsi="Times New Roman" w:cs="Times New Roman"/>
-              </w:rPr>
-            </w:pPr>
-            <w:r>
-              <w:rPr>
-                <w:rFonts w:ascii="Times New Roman" w:eastAsia="Times New Roman" w:hAnsi="Times New Roman" w:cs="Times New Roman"/>
-                <w:sz w:val="24"/>
+                <w:szCs w:val="22"/>
+              </w:rPr>
+            </w:pPr>
+            <w:r>
+              <w:rPr>
+                <w:rFonts w:ascii="Times New Roman" w:eastAsia="Times New Roman" w:hAnsi="Times New Roman" w:cs="Times New Roman"/>
+                <w:szCs w:val="22"/>
               </w:rPr>
               <w:t>•</w:t>
             </w:r>
@@ -1246,19 +842,19 @@
         </w:tc>
         <w:tc>
           <w:tcPr>
-            <w:tcW w:w="4513" w:type="dxa"/>
-          </w:tcPr>
-          <w:p>
-            <w:pPr>
-              <w:spacing w:after="0"/>
-              <w:rPr>
-                <w:rFonts w:ascii="Times New Roman" w:hAnsi="Times New Roman" w:cs="Times New Roman"/>
-              </w:rPr>
-            </w:pPr>
-            <w:r>
-              <w:rPr>
-                <w:rFonts w:ascii="Times New Roman" w:eastAsia="Times New Roman" w:hAnsi="Times New Roman" w:cs="Times New Roman"/>
-                <w:sz w:val="24"/>
+            <w:tcW w:w="4418" w:type="dxa"/>
+          </w:tcPr>
+          <w:p>
+            <w:pPr>
+              <w:rPr>
+                <w:rFonts w:ascii="Times New Roman" w:hAnsi="Times New Roman" w:cs="Times New Roman"/>
+                <w:szCs w:val="22"/>
+              </w:rPr>
+            </w:pPr>
+            <w:r>
+              <w:rPr>
+                <w:rFonts w:ascii="Times New Roman" w:eastAsia="Times New Roman" w:hAnsi="Times New Roman" w:cs="Times New Roman"/>
+                <w:szCs w:val="22"/>
               </w:rPr>
               <w:t xml:space="preserve">Data is very lacking. Test using more videos. </w:t>
             </w:r>
@@ -1266,20 +862,19 @@
         </w:tc>
         <w:tc>
           <w:tcPr>
-            <w:tcW w:w="3594" w:type="dxa"/>
-          </w:tcPr>
-          <w:p>
-            <w:pPr>
-              <w:spacing w:after="0"/>
-              <w:rPr>
-                <w:rFonts w:ascii="Times New Roman" w:eastAsia="Times New Roman" w:hAnsi="Times New Roman" w:cs="Times New Roman"/>
-                <w:sz w:val="24"/>
-              </w:rPr>
-            </w:pPr>
-            <w:r>
-              <w:rPr>
-                <w:rFonts w:ascii="Times New Roman" w:eastAsia="Times New Roman" w:hAnsi="Times New Roman" w:cs="Times New Roman"/>
-                <w:sz w:val="24"/>
+            <w:tcW w:w="3715" w:type="dxa"/>
+          </w:tcPr>
+          <w:p>
+            <w:pPr>
+              <w:rPr>
+                <w:rFonts w:ascii="Times New Roman" w:eastAsia="Times New Roman" w:hAnsi="Times New Roman" w:cs="Times New Roman"/>
+                <w:szCs w:val="22"/>
+              </w:rPr>
+            </w:pPr>
+            <w:r>
+              <w:rPr>
+                <w:rFonts w:ascii="Times New Roman" w:eastAsia="Times New Roman" w:hAnsi="Times New Roman" w:cs="Times New Roman"/>
+                <w:szCs w:val="22"/>
               </w:rPr>
               <w:t>Still Working on it</w:t>
             </w:r>
@@ -1292,33 +887,34 @@
         </w:trPr>
         <w:tc>
           <w:tcPr>
-            <w:tcW w:w="1778" w:type="dxa"/>
-          </w:tcPr>
-          <w:p>
-            <w:pPr>
-              <w:rPr>
-                <w:rFonts w:ascii="Times New Roman" w:hAnsi="Times New Roman" w:cs="Times New Roman"/>
-              </w:rPr>
-            </w:pPr>
-          </w:p>
-        </w:tc>
-        <w:tc>
-          <w:tcPr>
-            <w:tcW w:w="375" w:type="dxa"/>
-          </w:tcPr>
-          <w:p>
-            <w:pPr>
-              <w:spacing w:after="0"/>
+            <w:tcW w:w="1743" w:type="dxa"/>
+          </w:tcPr>
+          <w:p>
+            <w:pPr>
+              <w:rPr>
+                <w:rFonts w:ascii="Times New Roman" w:hAnsi="Times New Roman" w:cs="Times New Roman"/>
+                <w:szCs w:val="22"/>
+              </w:rPr>
+            </w:pPr>
+          </w:p>
+        </w:tc>
+        <w:tc>
+          <w:tcPr>
+            <w:tcW w:w="384" w:type="dxa"/>
+          </w:tcPr>
+          <w:p>
+            <w:pPr>
               <w:ind w:left="184"/>
               <w:jc w:val="center"/>
               <w:rPr>
                 <w:rFonts w:ascii="Times New Roman" w:hAnsi="Times New Roman" w:cs="Times New Roman"/>
-              </w:rPr>
-            </w:pPr>
-            <w:r>
-              <w:rPr>
-                <w:rFonts w:ascii="Times New Roman" w:eastAsia="Times New Roman" w:hAnsi="Times New Roman" w:cs="Times New Roman"/>
-                <w:sz w:val="24"/>
+                <w:szCs w:val="22"/>
+              </w:rPr>
+            </w:pPr>
+            <w:r>
+              <w:rPr>
+                <w:rFonts w:ascii="Times New Roman" w:eastAsia="Times New Roman" w:hAnsi="Times New Roman" w:cs="Times New Roman"/>
+                <w:szCs w:val="22"/>
               </w:rPr>
               <w:t>•</w:t>
             </w:r>
@@ -1326,19 +922,19 @@
         </w:tc>
         <w:tc>
           <w:tcPr>
-            <w:tcW w:w="4513" w:type="dxa"/>
-          </w:tcPr>
-          <w:p>
-            <w:pPr>
-              <w:spacing w:after="0"/>
-              <w:rPr>
-                <w:rFonts w:ascii="Times New Roman" w:hAnsi="Times New Roman" w:cs="Times New Roman"/>
-              </w:rPr>
-            </w:pPr>
-            <w:r>
-              <w:rPr>
-                <w:rFonts w:ascii="Times New Roman" w:eastAsia="Times New Roman" w:hAnsi="Times New Roman" w:cs="Times New Roman"/>
-                <w:sz w:val="24"/>
+            <w:tcW w:w="4418" w:type="dxa"/>
+          </w:tcPr>
+          <w:p>
+            <w:pPr>
+              <w:rPr>
+                <w:rFonts w:ascii="Times New Roman" w:hAnsi="Times New Roman" w:cs="Times New Roman"/>
+                <w:szCs w:val="22"/>
+              </w:rPr>
+            </w:pPr>
+            <w:r>
+              <w:rPr>
+                <w:rFonts w:ascii="Times New Roman" w:eastAsia="Times New Roman" w:hAnsi="Times New Roman" w:cs="Times New Roman"/>
+                <w:szCs w:val="22"/>
               </w:rPr>
               <w:t xml:space="preserve">Purchase your own camera for testing so that you can record the Plate Number as well. </w:t>
             </w:r>
@@ -1346,20 +942,19 @@
         </w:tc>
         <w:tc>
           <w:tcPr>
-            <w:tcW w:w="3594" w:type="dxa"/>
-          </w:tcPr>
-          <w:p>
-            <w:pPr>
-              <w:spacing w:after="0"/>
-              <w:rPr>
-                <w:rFonts w:ascii="Times New Roman" w:eastAsia="Times New Roman" w:hAnsi="Times New Roman" w:cs="Times New Roman"/>
-                <w:sz w:val="24"/>
-              </w:rPr>
-            </w:pPr>
-            <w:r>
-              <w:rPr>
-                <w:rFonts w:ascii="Times New Roman" w:eastAsia="Times New Roman" w:hAnsi="Times New Roman" w:cs="Times New Roman"/>
-                <w:sz w:val="24"/>
+            <w:tcW w:w="3715" w:type="dxa"/>
+          </w:tcPr>
+          <w:p>
+            <w:pPr>
+              <w:rPr>
+                <w:rFonts w:ascii="Times New Roman" w:eastAsia="Times New Roman" w:hAnsi="Times New Roman" w:cs="Times New Roman"/>
+                <w:szCs w:val="22"/>
+              </w:rPr>
+            </w:pPr>
+            <w:r>
+              <w:rPr>
+                <w:rFonts w:ascii="Times New Roman" w:eastAsia="Times New Roman" w:hAnsi="Times New Roman" w:cs="Times New Roman"/>
+                <w:szCs w:val="22"/>
               </w:rPr>
               <w:t>Camera available</w:t>
             </w:r>
@@ -1372,33 +967,34 @@
         </w:trPr>
         <w:tc>
           <w:tcPr>
-            <w:tcW w:w="1778" w:type="dxa"/>
-          </w:tcPr>
-          <w:p>
-            <w:pPr>
-              <w:rPr>
-                <w:rFonts w:ascii="Times New Roman" w:hAnsi="Times New Roman" w:cs="Times New Roman"/>
-              </w:rPr>
-            </w:pPr>
-          </w:p>
-        </w:tc>
-        <w:tc>
-          <w:tcPr>
-            <w:tcW w:w="375" w:type="dxa"/>
-          </w:tcPr>
-          <w:p>
-            <w:pPr>
-              <w:spacing w:after="0"/>
+            <w:tcW w:w="1743" w:type="dxa"/>
+          </w:tcPr>
+          <w:p>
+            <w:pPr>
+              <w:rPr>
+                <w:rFonts w:ascii="Times New Roman" w:hAnsi="Times New Roman" w:cs="Times New Roman"/>
+                <w:szCs w:val="22"/>
+              </w:rPr>
+            </w:pPr>
+          </w:p>
+        </w:tc>
+        <w:tc>
+          <w:tcPr>
+            <w:tcW w:w="384" w:type="dxa"/>
+          </w:tcPr>
+          <w:p>
+            <w:pPr>
               <w:ind w:left="184"/>
               <w:jc w:val="center"/>
               <w:rPr>
                 <w:rFonts w:ascii="Times New Roman" w:hAnsi="Times New Roman" w:cs="Times New Roman"/>
-              </w:rPr>
-            </w:pPr>
-            <w:r>
-              <w:rPr>
-                <w:rFonts w:ascii="Times New Roman" w:eastAsia="Times New Roman" w:hAnsi="Times New Roman" w:cs="Times New Roman"/>
-                <w:sz w:val="24"/>
+                <w:szCs w:val="22"/>
+              </w:rPr>
+            </w:pPr>
+            <w:r>
+              <w:rPr>
+                <w:rFonts w:ascii="Times New Roman" w:eastAsia="Times New Roman" w:hAnsi="Times New Roman" w:cs="Times New Roman"/>
+                <w:szCs w:val="22"/>
               </w:rPr>
               <w:t>•</w:t>
             </w:r>
@@ -1406,19 +1002,19 @@
         </w:tc>
         <w:tc>
           <w:tcPr>
-            <w:tcW w:w="4513" w:type="dxa"/>
-          </w:tcPr>
-          <w:p>
-            <w:pPr>
-              <w:spacing w:after="0"/>
-              <w:rPr>
-                <w:rFonts w:ascii="Times New Roman" w:hAnsi="Times New Roman" w:cs="Times New Roman"/>
-              </w:rPr>
-            </w:pPr>
-            <w:r>
-              <w:rPr>
-                <w:rFonts w:ascii="Times New Roman" w:eastAsia="Times New Roman" w:hAnsi="Times New Roman" w:cs="Times New Roman"/>
-                <w:sz w:val="24"/>
+            <w:tcW w:w="4418" w:type="dxa"/>
+          </w:tcPr>
+          <w:p>
+            <w:pPr>
+              <w:rPr>
+                <w:rFonts w:ascii="Times New Roman" w:hAnsi="Times New Roman" w:cs="Times New Roman"/>
+                <w:szCs w:val="22"/>
+              </w:rPr>
+            </w:pPr>
+            <w:r>
+              <w:rPr>
+                <w:rFonts w:ascii="Times New Roman" w:eastAsia="Times New Roman" w:hAnsi="Times New Roman" w:cs="Times New Roman"/>
+                <w:szCs w:val="22"/>
               </w:rPr>
               <w:t xml:space="preserve">Add a Login functionality. Improve dashboard UI. </w:t>
             </w:r>
@@ -1426,20 +1022,20 @@
         </w:tc>
         <w:tc>
           <w:tcPr>
-            <w:tcW w:w="3594" w:type="dxa"/>
-          </w:tcPr>
-          <w:p>
-            <w:pPr>
-              <w:spacing w:after="0"/>
-              <w:rPr>
-                <w:rFonts w:ascii="Times New Roman" w:eastAsia="Times New Roman" w:hAnsi="Times New Roman" w:cs="Times New Roman"/>
-                <w:sz w:val="24"/>
-              </w:rPr>
-            </w:pPr>
-            <w:r>
-              <w:rPr>
-                <w:rFonts w:ascii="Times New Roman" w:eastAsia="Times New Roman" w:hAnsi="Times New Roman" w:cs="Times New Roman"/>
-                <w:sz w:val="24"/>
+            <w:tcW w:w="3715" w:type="dxa"/>
+          </w:tcPr>
+          <w:p>
+            <w:pPr>
+              <w:rPr>
+                <w:rFonts w:ascii="Times New Roman" w:eastAsia="Times New Roman" w:hAnsi="Times New Roman" w:cs="Times New Roman"/>
+                <w:szCs w:val="22"/>
+              </w:rPr>
+            </w:pPr>
+            <w:r>
+              <w:rPr>
+                <w:rFonts w:ascii="Times New Roman" w:eastAsia="Times New Roman" w:hAnsi="Times New Roman" w:cs="Times New Roman"/>
+                <w:noProof/>
+                <w:szCs w:val="22"/>
               </w:rPr>
               <w:drawing>
                 <wp:inline distT="0" distB="0" distL="0" distR="0" wp14:anchorId="258E9565" wp14:editId="7A8D1D53">
@@ -1486,33 +1082,34 @@
         </w:trPr>
         <w:tc>
           <w:tcPr>
-            <w:tcW w:w="1778" w:type="dxa"/>
-          </w:tcPr>
-          <w:p>
-            <w:pPr>
-              <w:rPr>
-                <w:rFonts w:ascii="Times New Roman" w:hAnsi="Times New Roman" w:cs="Times New Roman"/>
-              </w:rPr>
-            </w:pPr>
-          </w:p>
-        </w:tc>
-        <w:tc>
-          <w:tcPr>
-            <w:tcW w:w="375" w:type="dxa"/>
-          </w:tcPr>
-          <w:p>
-            <w:pPr>
-              <w:spacing w:after="0"/>
+            <w:tcW w:w="1743" w:type="dxa"/>
+          </w:tcPr>
+          <w:p>
+            <w:pPr>
+              <w:rPr>
+                <w:rFonts w:ascii="Times New Roman" w:hAnsi="Times New Roman" w:cs="Times New Roman"/>
+                <w:szCs w:val="22"/>
+              </w:rPr>
+            </w:pPr>
+          </w:p>
+        </w:tc>
+        <w:tc>
+          <w:tcPr>
+            <w:tcW w:w="384" w:type="dxa"/>
+          </w:tcPr>
+          <w:p>
+            <w:pPr>
               <w:ind w:left="184"/>
               <w:jc w:val="center"/>
               <w:rPr>
                 <w:rFonts w:ascii="Times New Roman" w:hAnsi="Times New Roman" w:cs="Times New Roman"/>
-              </w:rPr>
-            </w:pPr>
-            <w:r>
-              <w:rPr>
-                <w:rFonts w:ascii="Times New Roman" w:eastAsia="Times New Roman" w:hAnsi="Times New Roman" w:cs="Times New Roman"/>
-                <w:sz w:val="24"/>
+                <w:szCs w:val="22"/>
+              </w:rPr>
+            </w:pPr>
+            <w:r>
+              <w:rPr>
+                <w:rFonts w:ascii="Times New Roman" w:eastAsia="Times New Roman" w:hAnsi="Times New Roman" w:cs="Times New Roman"/>
+                <w:szCs w:val="22"/>
               </w:rPr>
               <w:t>•</w:t>
             </w:r>
@@ -1520,19 +1117,19 @@
         </w:tc>
         <w:tc>
           <w:tcPr>
-            <w:tcW w:w="4513" w:type="dxa"/>
-          </w:tcPr>
-          <w:p>
-            <w:pPr>
-              <w:spacing w:after="0"/>
-              <w:rPr>
-                <w:rFonts w:ascii="Times New Roman" w:hAnsi="Times New Roman" w:cs="Times New Roman"/>
-              </w:rPr>
-            </w:pPr>
-            <w:r>
-              <w:rPr>
-                <w:rFonts w:ascii="Times New Roman" w:eastAsia="Times New Roman" w:hAnsi="Times New Roman" w:cs="Times New Roman"/>
-                <w:sz w:val="24"/>
+            <w:tcW w:w="4418" w:type="dxa"/>
+          </w:tcPr>
+          <w:p>
+            <w:pPr>
+              <w:rPr>
+                <w:rFonts w:ascii="Times New Roman" w:hAnsi="Times New Roman" w:cs="Times New Roman"/>
+                <w:szCs w:val="22"/>
+              </w:rPr>
+            </w:pPr>
+            <w:r>
+              <w:rPr>
+                <w:rFonts w:ascii="Times New Roman" w:eastAsia="Times New Roman" w:hAnsi="Times New Roman" w:cs="Times New Roman"/>
+                <w:szCs w:val="22"/>
               </w:rPr>
               <w:t xml:space="preserve">Upon entering the </w:t>
             </w:r>
@@ -1540,7 +1137,7 @@
             <w:r>
               <w:rPr>
                 <w:rFonts w:ascii="Times New Roman" w:eastAsia="Times New Roman" w:hAnsi="Times New Roman" w:cs="Times New Roman"/>
-                <w:sz w:val="24"/>
+                <w:szCs w:val="22"/>
               </w:rPr>
               <w:t>yellowbox</w:t>
             </w:r>
@@ -1548,7 +1145,7 @@
             <w:r>
               <w:rPr>
                 <w:rFonts w:ascii="Times New Roman" w:eastAsia="Times New Roman" w:hAnsi="Times New Roman" w:cs="Times New Roman"/>
-                <w:sz w:val="24"/>
+                <w:szCs w:val="22"/>
               </w:rPr>
               <w:t xml:space="preserve">, system should capture the plate number of the </w:t>
             </w:r>
@@ -1556,7 +1153,7 @@
             <w:r>
               <w:rPr>
                 <w:rFonts w:ascii="Times New Roman" w:eastAsia="Times New Roman" w:hAnsi="Times New Roman" w:cs="Times New Roman"/>
-                <w:sz w:val="24"/>
+                <w:szCs w:val="22"/>
               </w:rPr>
               <w:t>multicab</w:t>
             </w:r>
@@ -1564,7 +1161,7 @@
             <w:r>
               <w:rPr>
                 <w:rFonts w:ascii="Times New Roman" w:eastAsia="Times New Roman" w:hAnsi="Times New Roman" w:cs="Times New Roman"/>
-                <w:sz w:val="24"/>
+                <w:szCs w:val="22"/>
               </w:rPr>
               <w:t xml:space="preserve">. If a violation </w:t>
             </w:r>
@@ -1572,7 +1169,7 @@
             <w:r>
               <w:rPr>
                 <w:rFonts w:ascii="Times New Roman" w:eastAsia="Times New Roman" w:hAnsi="Times New Roman" w:cs="Times New Roman"/>
-                <w:sz w:val="24"/>
+                <w:szCs w:val="22"/>
               </w:rPr>
               <w:t>occurred</w:t>
             </w:r>
@@ -1580,7 +1177,7 @@
             <w:r>
               <w:rPr>
                 <w:rFonts w:ascii="Times New Roman" w:eastAsia="Times New Roman" w:hAnsi="Times New Roman" w:cs="Times New Roman"/>
-                <w:sz w:val="24"/>
+                <w:szCs w:val="22"/>
               </w:rPr>
               <w:t>, then store the plate number in the database. If no violation occurred, disregard the captured plate number.</w:t>
             </w:r>
@@ -1588,42 +1185,27 @@
         </w:tc>
         <w:tc>
           <w:tcPr>
-            <w:tcW w:w="3594" w:type="dxa"/>
-          </w:tcPr>
-          <w:p>
-            <w:pPr>
-              <w:spacing w:after="0"/>
-              <w:rPr>
-                <w:rFonts w:ascii="Times New Roman" w:eastAsia="Times New Roman" w:hAnsi="Times New Roman" w:cs="Times New Roman"/>
-                <w:sz w:val="24"/>
-              </w:rPr>
-            </w:pPr>
-            <w:r>
-              <w:rPr>
-                <w:rFonts w:ascii="Times New Roman" w:eastAsia="Times New Roman" w:hAnsi="Times New Roman" w:cs="Times New Roman"/>
-                <w:sz w:val="24"/>
-              </w:rPr>
-              <w:t xml:space="preserve">When the </w:t>
-            </w:r>
-            <w:r>
-              <w:rPr>
-                <w:rFonts w:ascii="Times New Roman" w:eastAsia="Times New Roman" w:hAnsi="Times New Roman" w:cs="Times New Roman"/>
-                <w:sz w:val="24"/>
-              </w:rPr>
-              <w:t>vehicles</w:t>
-            </w:r>
-            <w:r>
-              <w:rPr>
-                <w:rFonts w:ascii="Times New Roman" w:eastAsia="Times New Roman" w:hAnsi="Times New Roman" w:cs="Times New Roman"/>
-                <w:sz w:val="24"/>
-              </w:rPr>
-              <w:t xml:space="preserve"> </w:t>
+            <w:tcW w:w="3715" w:type="dxa"/>
+          </w:tcPr>
+          <w:p>
+            <w:pPr>
+              <w:rPr>
+                <w:rFonts w:ascii="Times New Roman" w:eastAsia="Times New Roman" w:hAnsi="Times New Roman" w:cs="Times New Roman"/>
+                <w:szCs w:val="22"/>
+              </w:rPr>
+            </w:pPr>
+            <w:r>
+              <w:rPr>
+                <w:rFonts w:ascii="Times New Roman" w:eastAsia="Times New Roman" w:hAnsi="Times New Roman" w:cs="Times New Roman"/>
+                <w:szCs w:val="22"/>
+              </w:rPr>
+              <w:t xml:space="preserve">When the vehicles </w:t>
             </w:r>
             <w:proofErr w:type="gramStart"/>
             <w:r>
               <w:rPr>
                 <w:rFonts w:ascii="Times New Roman" w:eastAsia="Times New Roman" w:hAnsi="Times New Roman" w:cs="Times New Roman"/>
-                <w:sz w:val="24"/>
+                <w:szCs w:val="22"/>
               </w:rPr>
               <w:t>enters</w:t>
             </w:r>
@@ -1631,23 +1213,22 @@
             <w:r>
               <w:rPr>
                 <w:rFonts w:ascii="Times New Roman" w:eastAsia="Times New Roman" w:hAnsi="Times New Roman" w:cs="Times New Roman"/>
-                <w:sz w:val="24"/>
+                <w:szCs w:val="22"/>
               </w:rPr>
               <w:t xml:space="preserve"> the yellow box, the system should capture its plate number. If a violation occurs, the plate number will be stored in the database; otherwise, it will be disregarded.</w:t>
             </w:r>
           </w:p>
           <w:p>
             <w:pPr>
-              <w:spacing w:after="0"/>
-              <w:rPr>
-                <w:rFonts w:ascii="Times New Roman" w:eastAsia="Times New Roman" w:hAnsi="Times New Roman" w:cs="Times New Roman"/>
-                <w:sz w:val="24"/>
-              </w:rPr>
-            </w:pPr>
-            <w:r>
-              <w:rPr>
-                <w:rFonts w:ascii="Times New Roman" w:eastAsia="Times New Roman" w:hAnsi="Times New Roman" w:cs="Times New Roman"/>
-                <w:sz w:val="24"/>
+              <w:rPr>
+                <w:rFonts w:ascii="Times New Roman" w:eastAsia="Times New Roman" w:hAnsi="Times New Roman" w:cs="Times New Roman"/>
+                <w:szCs w:val="22"/>
+              </w:rPr>
+            </w:pPr>
+            <w:r>
+              <w:rPr>
+                <w:rFonts w:ascii="Times New Roman" w:eastAsia="Times New Roman" w:hAnsi="Times New Roman" w:cs="Times New Roman"/>
+                <w:szCs w:val="22"/>
               </w:rPr>
               <w:t xml:space="preserve">However, plate detection is currently difficult because the camera is too far, the video quality is low, and the camera angle affects </w:t>
             </w:r>
@@ -1655,7 +1236,7 @@
             <w:r>
               <w:rPr>
                 <w:rFonts w:ascii="Times New Roman" w:eastAsia="Times New Roman" w:hAnsi="Times New Roman" w:cs="Times New Roman"/>
-                <w:sz w:val="24"/>
+                <w:szCs w:val="22"/>
               </w:rPr>
               <w:t>EasyOCR's</w:t>
             </w:r>
@@ -1663,17 +1244,16 @@
             <w:r>
               <w:rPr>
                 <w:rFonts w:ascii="Times New Roman" w:eastAsia="Times New Roman" w:hAnsi="Times New Roman" w:cs="Times New Roman"/>
-                <w:sz w:val="24"/>
+                <w:szCs w:val="22"/>
               </w:rPr>
               <w:t xml:space="preserve"> ability to recognize the plate accurately.</w:t>
             </w:r>
           </w:p>
           <w:p>
             <w:pPr>
-              <w:spacing w:after="0"/>
-              <w:rPr>
-                <w:rFonts w:ascii="Times New Roman" w:eastAsia="Times New Roman" w:hAnsi="Times New Roman" w:cs="Times New Roman"/>
-                <w:sz w:val="24"/>
+              <w:rPr>
+                <w:rFonts w:ascii="Times New Roman" w:eastAsia="Times New Roman" w:hAnsi="Times New Roman" w:cs="Times New Roman"/>
+                <w:szCs w:val="22"/>
               </w:rPr>
             </w:pPr>
           </w:p>
@@ -1692,6 +1272,7 @@
         <w:ind w:right="-15"/>
         <w:rPr>
           <w:rFonts w:ascii="Times New Roman" w:hAnsi="Times New Roman" w:cs="Times New Roman"/>
+          <w:szCs w:val="22"/>
         </w:rPr>
       </w:pPr>
     </w:p>
@@ -1707,15 +1288,25 @@
         <w:ind w:right="-15"/>
         <w:rPr>
           <w:rFonts w:ascii="Times New Roman" w:hAnsi="Times New Roman" w:cs="Times New Roman"/>
+          <w:szCs w:val="22"/>
+        </w:rPr>
+      </w:pPr>
+    </w:p>
+    <w:p>
+      <w:pPr>
+        <w:spacing w:after="220" w:line="265" w:lineRule="auto"/>
+        <w:rPr>
+          <w:rFonts w:ascii="Times New Roman" w:hAnsi="Times New Roman" w:cs="Times New Roman"/>
+          <w:szCs w:val="22"/>
         </w:rPr>
       </w:pPr>
     </w:p>
     <w:tbl>
       <w:tblPr>
         <w:tblStyle w:val="TableGrid"/>
-        <w:tblpPr w:vertAnchor="text" w:tblpX="365" w:tblpY="977"/>
+        <w:tblpPr w:vertAnchor="text" w:horzAnchor="margin" w:tblpY="179"/>
         <w:tblOverlap w:val="never"/>
-        <w:tblW w:w="9895" w:type="dxa"/>
+        <w:tblW w:w="10080" w:type="dxa"/>
         <w:tblInd w:w="0" w:type="dxa"/>
         <w:tblBorders>
           <w:top w:val="single" w:sz="4" w:space="0" w:color="auto"/>
@@ -1727,16 +1318,14 @@
         </w:tblBorders>
         <w:tblCellMar>
           <w:top w:w="17" w:type="dxa"/>
-          <w:left w:w="0" w:type="dxa"/>
-          <w:bottom w:w="0" w:type="dxa"/>
           <w:right w:w="115" w:type="dxa"/>
         </w:tblCellMar>
         <w:tblLook w:val="04A0" w:firstRow="1" w:lastRow="0" w:firstColumn="1" w:lastColumn="0" w:noHBand="0" w:noVBand="1"/>
       </w:tblPr>
       <w:tblGrid>
-        <w:gridCol w:w="1066"/>
-        <w:gridCol w:w="384"/>
-        <w:gridCol w:w="3823"/>
+        <w:gridCol w:w="2007"/>
+        <w:gridCol w:w="377"/>
+        <w:gridCol w:w="3074"/>
         <w:gridCol w:w="4622"/>
       </w:tblGrid>
       <w:tr>
@@ -1745,55 +1334,55 @@
         </w:trPr>
         <w:tc>
           <w:tcPr>
-            <w:tcW w:w="1066" w:type="dxa"/>
-          </w:tcPr>
-          <w:p>
-            <w:pPr>
-              <w:spacing w:after="0"/>
+            <w:tcW w:w="2007" w:type="dxa"/>
+          </w:tcPr>
+          <w:p>
+            <w:pPr>
               <w:ind w:left="351"/>
               <w:rPr>
                 <w:rFonts w:ascii="Times New Roman" w:hAnsi="Times New Roman" w:cs="Times New Roman"/>
+                <w:szCs w:val="22"/>
               </w:rPr>
             </w:pPr>
             <w:r>
               <w:rPr>
                 <w:rFonts w:ascii="Times New Roman" w:eastAsia="Times New Roman" w:hAnsi="Times New Roman" w:cs="Times New Roman"/>
                 <w:b/>
-                <w:sz w:val="24"/>
-              </w:rPr>
-              <w:lastRenderedPageBreak/>
+                <w:szCs w:val="22"/>
+              </w:rPr>
               <w:t>Name of Panel</w:t>
             </w:r>
           </w:p>
         </w:tc>
         <w:tc>
           <w:tcPr>
-            <w:tcW w:w="384" w:type="dxa"/>
-          </w:tcPr>
-          <w:p>
-            <w:pPr>
-              <w:rPr>
-                <w:rFonts w:ascii="Times New Roman" w:hAnsi="Times New Roman" w:cs="Times New Roman"/>
-              </w:rPr>
-            </w:pPr>
-          </w:p>
-        </w:tc>
-        <w:tc>
-          <w:tcPr>
-            <w:tcW w:w="4666" w:type="dxa"/>
-          </w:tcPr>
-          <w:p>
-            <w:pPr>
-              <w:spacing w:after="0"/>
-              <w:rPr>
-                <w:rFonts w:ascii="Times New Roman" w:hAnsi="Times New Roman" w:cs="Times New Roman"/>
+            <w:tcW w:w="377" w:type="dxa"/>
+          </w:tcPr>
+          <w:p>
+            <w:pPr>
+              <w:rPr>
+                <w:rFonts w:ascii="Times New Roman" w:hAnsi="Times New Roman" w:cs="Times New Roman"/>
+                <w:szCs w:val="22"/>
+              </w:rPr>
+            </w:pPr>
+          </w:p>
+        </w:tc>
+        <w:tc>
+          <w:tcPr>
+            <w:tcW w:w="3074" w:type="dxa"/>
+          </w:tcPr>
+          <w:p>
+            <w:pPr>
+              <w:rPr>
+                <w:rFonts w:ascii="Times New Roman" w:hAnsi="Times New Roman" w:cs="Times New Roman"/>
+                <w:szCs w:val="22"/>
               </w:rPr>
             </w:pPr>
             <w:r>
               <w:rPr>
                 <w:rFonts w:ascii="Times New Roman" w:eastAsia="Times New Roman" w:hAnsi="Times New Roman" w:cs="Times New Roman"/>
                 <w:b/>
-                <w:sz w:val="24"/>
+                <w:szCs w:val="22"/>
               </w:rPr>
               <w:t>COMMENTS/SUGGESTIONS</w:t>
             </w:r>
@@ -1801,16 +1390,15 @@
         </w:tc>
         <w:tc>
           <w:tcPr>
-            <w:tcW w:w="3779" w:type="dxa"/>
-          </w:tcPr>
-          <w:p>
-            <w:pPr>
-              <w:spacing w:after="0"/>
+            <w:tcW w:w="4622" w:type="dxa"/>
+          </w:tcPr>
+          <w:p>
+            <w:pPr>
               <w:ind w:left="1323"/>
               <w:rPr>
                 <w:rFonts w:ascii="Times New Roman" w:eastAsia="Times New Roman" w:hAnsi="Times New Roman" w:cs="Times New Roman"/>
                 <w:b/>
-                <w:sz w:val="24"/>
+                <w:szCs w:val="22"/>
               </w:rPr>
             </w:pPr>
           </w:p>
@@ -1822,21 +1410,21 @@
         </w:trPr>
         <w:tc>
           <w:tcPr>
-            <w:tcW w:w="1066" w:type="dxa"/>
-          </w:tcPr>
-          <w:p>
-            <w:pPr>
-              <w:spacing w:after="0"/>
+            <w:tcW w:w="2007" w:type="dxa"/>
+          </w:tcPr>
+          <w:p>
+            <w:pPr>
               <w:ind w:left="345"/>
               <w:rPr>
                 <w:rFonts w:ascii="Times New Roman" w:hAnsi="Times New Roman" w:cs="Times New Roman"/>
+                <w:szCs w:val="22"/>
               </w:rPr>
             </w:pPr>
             <w:r>
               <w:rPr>
                 <w:rFonts w:ascii="Times New Roman" w:eastAsia="Times New Roman" w:hAnsi="Times New Roman" w:cs="Times New Roman"/>
                 <w:b/>
-                <w:sz w:val="24"/>
+                <w:szCs w:val="22"/>
               </w:rPr>
               <w:t>Anna Rose C. Tan</w:t>
             </w:r>
@@ -1844,21 +1432,21 @@
         </w:tc>
         <w:tc>
           <w:tcPr>
-            <w:tcW w:w="384" w:type="dxa"/>
-          </w:tcPr>
-          <w:p>
-            <w:pPr>
-              <w:spacing w:after="0"/>
+            <w:tcW w:w="377" w:type="dxa"/>
+          </w:tcPr>
+          <w:p>
+            <w:pPr>
               <w:ind w:left="184"/>
               <w:jc w:val="center"/>
               <w:rPr>
                 <w:rFonts w:ascii="Times New Roman" w:hAnsi="Times New Roman" w:cs="Times New Roman"/>
-              </w:rPr>
-            </w:pPr>
-            <w:r>
-              <w:rPr>
-                <w:rFonts w:ascii="Times New Roman" w:eastAsia="Times New Roman" w:hAnsi="Times New Roman" w:cs="Times New Roman"/>
-                <w:sz w:val="24"/>
+                <w:szCs w:val="22"/>
+              </w:rPr>
+            </w:pPr>
+            <w:r>
+              <w:rPr>
+                <w:rFonts w:ascii="Times New Roman" w:eastAsia="Times New Roman" w:hAnsi="Times New Roman" w:cs="Times New Roman"/>
+                <w:szCs w:val="22"/>
               </w:rPr>
               <w:t>•</w:t>
             </w:r>
@@ -1866,19 +1454,19 @@
         </w:tc>
         <w:tc>
           <w:tcPr>
-            <w:tcW w:w="4666" w:type="dxa"/>
-          </w:tcPr>
-          <w:p>
-            <w:pPr>
-              <w:spacing w:after="0"/>
-              <w:rPr>
-                <w:rFonts w:ascii="Times New Roman" w:hAnsi="Times New Roman" w:cs="Times New Roman"/>
-              </w:rPr>
-            </w:pPr>
-            <w:r>
-              <w:rPr>
-                <w:rFonts w:ascii="Times New Roman" w:eastAsia="Times New Roman" w:hAnsi="Times New Roman" w:cs="Times New Roman"/>
-                <w:sz w:val="24"/>
+            <w:tcW w:w="3074" w:type="dxa"/>
+          </w:tcPr>
+          <w:p>
+            <w:pPr>
+              <w:rPr>
+                <w:rFonts w:ascii="Times New Roman" w:hAnsi="Times New Roman" w:cs="Times New Roman"/>
+                <w:szCs w:val="22"/>
+              </w:rPr>
+            </w:pPr>
+            <w:r>
+              <w:rPr>
+                <w:rFonts w:ascii="Times New Roman" w:eastAsia="Times New Roman" w:hAnsi="Times New Roman" w:cs="Times New Roman"/>
+                <w:szCs w:val="22"/>
               </w:rPr>
               <w:t xml:space="preserve">Improve dashboard UI.  </w:t>
             </w:r>
@@ -1886,23 +1474,23 @@
         </w:tc>
         <w:tc>
           <w:tcPr>
-            <w:tcW w:w="3779" w:type="dxa"/>
-          </w:tcPr>
-          <w:p>
-            <w:pPr>
-              <w:spacing w:after="0"/>
-              <w:rPr>
-                <w:rFonts w:ascii="Times New Roman" w:eastAsia="Times New Roman" w:hAnsi="Times New Roman" w:cs="Times New Roman"/>
-                <w:sz w:val="24"/>
-              </w:rPr>
-            </w:pPr>
-            <w:r>
-              <w:rPr>
-                <w:rFonts w:ascii="Times New Roman" w:eastAsia="Times New Roman" w:hAnsi="Times New Roman" w:cs="Times New Roman"/>
-                <w:sz w:val="24"/>
+            <w:tcW w:w="4622" w:type="dxa"/>
+          </w:tcPr>
+          <w:p>
+            <w:pPr>
+              <w:rPr>
+                <w:rFonts w:ascii="Times New Roman" w:eastAsia="Times New Roman" w:hAnsi="Times New Roman" w:cs="Times New Roman"/>
+                <w:szCs w:val="22"/>
+              </w:rPr>
+            </w:pPr>
+            <w:r>
+              <w:rPr>
+                <w:rFonts w:ascii="Times New Roman" w:eastAsia="Times New Roman" w:hAnsi="Times New Roman" w:cs="Times New Roman"/>
+                <w:noProof/>
+                <w:szCs w:val="22"/>
               </w:rPr>
               <w:drawing>
-                <wp:inline distT="0" distB="0" distL="0" distR="0" wp14:anchorId="7C0DE2E3" wp14:editId="5FC77431">
+                <wp:inline distT="0" distB="0" distL="0" distR="0" wp14:anchorId="26072F79" wp14:editId="7CB506C6">
                   <wp:extent cx="2820970" cy="1488268"/>
                   <wp:effectExtent l="0" t="0" r="0" b="0"/>
                   <wp:docPr id="944394169" name="Picture 1"/>
@@ -1946,19 +1534,20 @@
         </w:trPr>
         <w:tc>
           <w:tcPr>
-            <w:tcW w:w="1066" w:type="dxa"/>
-          </w:tcPr>
-          <w:p>
-            <w:pPr>
-              <w:rPr>
-                <w:rFonts w:ascii="Times New Roman" w:hAnsi="Times New Roman" w:cs="Times New Roman"/>
-              </w:rPr>
-            </w:pPr>
-          </w:p>
-        </w:tc>
-        <w:tc>
-          <w:tcPr>
-            <w:tcW w:w="384" w:type="dxa"/>
+            <w:tcW w:w="2007" w:type="dxa"/>
+          </w:tcPr>
+          <w:p>
+            <w:pPr>
+              <w:rPr>
+                <w:rFonts w:ascii="Times New Roman" w:hAnsi="Times New Roman" w:cs="Times New Roman"/>
+                <w:szCs w:val="22"/>
+              </w:rPr>
+            </w:pPr>
+          </w:p>
+        </w:tc>
+        <w:tc>
+          <w:tcPr>
+            <w:tcW w:w="377" w:type="dxa"/>
           </w:tcPr>
           <w:p>
             <w:pPr>
@@ -1967,29 +1556,30 @@
               <w:jc w:val="center"/>
               <w:rPr>
                 <w:rFonts w:ascii="Times New Roman" w:hAnsi="Times New Roman" w:cs="Times New Roman"/>
-              </w:rPr>
-            </w:pPr>
-            <w:r>
-              <w:rPr>
-                <w:rFonts w:ascii="Times New Roman" w:eastAsia="Times New Roman" w:hAnsi="Times New Roman" w:cs="Times New Roman"/>
-                <w:sz w:val="24"/>
+                <w:szCs w:val="22"/>
+              </w:rPr>
+            </w:pPr>
+            <w:r>
+              <w:rPr>
+                <w:rFonts w:ascii="Times New Roman" w:eastAsia="Times New Roman" w:hAnsi="Times New Roman" w:cs="Times New Roman"/>
+                <w:szCs w:val="22"/>
               </w:rPr>
               <w:t>•</w:t>
             </w:r>
           </w:p>
           <w:p>
             <w:pPr>
-              <w:spacing w:after="0"/>
               <w:ind w:left="184"/>
               <w:jc w:val="center"/>
               <w:rPr>
                 <w:rFonts w:ascii="Times New Roman" w:hAnsi="Times New Roman" w:cs="Times New Roman"/>
-              </w:rPr>
-            </w:pPr>
-            <w:r>
-              <w:rPr>
-                <w:rFonts w:ascii="Times New Roman" w:eastAsia="Times New Roman" w:hAnsi="Times New Roman" w:cs="Times New Roman"/>
-                <w:sz w:val="24"/>
+                <w:szCs w:val="22"/>
+              </w:rPr>
+            </w:pPr>
+            <w:r>
+              <w:rPr>
+                <w:rFonts w:ascii="Times New Roman" w:eastAsia="Times New Roman" w:hAnsi="Times New Roman" w:cs="Times New Roman"/>
+                <w:szCs w:val="22"/>
               </w:rPr>
               <w:t>•</w:t>
             </w:r>
@@ -1997,51 +1587,51 @@
         </w:tc>
         <w:tc>
           <w:tcPr>
-            <w:tcW w:w="4666" w:type="dxa"/>
-          </w:tcPr>
-          <w:p>
-            <w:pPr>
-              <w:spacing w:after="0"/>
-              <w:rPr>
-                <w:rFonts w:ascii="Times New Roman" w:hAnsi="Times New Roman" w:cs="Times New Roman"/>
-              </w:rPr>
-            </w:pPr>
-            <w:r>
-              <w:rPr>
-                <w:rFonts w:ascii="Times New Roman" w:eastAsia="Times New Roman" w:hAnsi="Times New Roman" w:cs="Times New Roman"/>
-                <w:sz w:val="24"/>
+            <w:tcW w:w="3074" w:type="dxa"/>
+          </w:tcPr>
+          <w:p>
+            <w:pPr>
+              <w:rPr>
+                <w:rFonts w:ascii="Times New Roman" w:hAnsi="Times New Roman" w:cs="Times New Roman"/>
+                <w:szCs w:val="22"/>
+              </w:rPr>
+            </w:pPr>
+            <w:r>
+              <w:rPr>
+                <w:rFonts w:ascii="Times New Roman" w:eastAsia="Times New Roman" w:hAnsi="Times New Roman" w:cs="Times New Roman"/>
+                <w:szCs w:val="22"/>
               </w:rPr>
               <w:t xml:space="preserve">TMC dashboard should have a notification every time a violation is detected. </w:t>
             </w:r>
           </w:p>
           <w:p>
             <w:pPr>
-              <w:spacing w:after="0"/>
-              <w:rPr>
-                <w:rFonts w:ascii="Times New Roman" w:hAnsi="Times New Roman" w:cs="Times New Roman"/>
-              </w:rPr>
-            </w:pPr>
-          </w:p>
-        </w:tc>
-        <w:tc>
-          <w:tcPr>
-            <w:tcW w:w="3779" w:type="dxa"/>
-          </w:tcPr>
-          <w:p>
-            <w:pPr>
-              <w:spacing w:after="0"/>
-              <w:rPr>
-                <w:rFonts w:ascii="Times New Roman" w:eastAsia="Times New Roman" w:hAnsi="Times New Roman" w:cs="Times New Roman"/>
-                <w:sz w:val="24"/>
-              </w:rPr>
-            </w:pPr>
-            <w:r>
-              <w:rPr>
-                <w:rFonts w:ascii="Times New Roman" w:eastAsia="Times New Roman" w:hAnsi="Times New Roman" w:cs="Times New Roman"/>
-                <w:sz w:val="24"/>
+              <w:rPr>
+                <w:rFonts w:ascii="Times New Roman" w:hAnsi="Times New Roman" w:cs="Times New Roman"/>
+                <w:szCs w:val="22"/>
+              </w:rPr>
+            </w:pPr>
+          </w:p>
+        </w:tc>
+        <w:tc>
+          <w:tcPr>
+            <w:tcW w:w="4622" w:type="dxa"/>
+          </w:tcPr>
+          <w:p>
+            <w:pPr>
+              <w:rPr>
+                <w:rFonts w:ascii="Times New Roman" w:eastAsia="Times New Roman" w:hAnsi="Times New Roman" w:cs="Times New Roman"/>
+                <w:szCs w:val="22"/>
+              </w:rPr>
+            </w:pPr>
+            <w:r>
+              <w:rPr>
+                <w:rFonts w:ascii="Times New Roman" w:eastAsia="Times New Roman" w:hAnsi="Times New Roman" w:cs="Times New Roman"/>
+                <w:noProof/>
+                <w:szCs w:val="22"/>
               </w:rPr>
               <w:drawing>
-                <wp:inline distT="0" distB="0" distL="0" distR="0" wp14:anchorId="73DF5FD4" wp14:editId="260CBF29">
+                <wp:inline distT="0" distB="0" distL="0" distR="0" wp14:anchorId="47D1E79E" wp14:editId="5AAF84D2">
                   <wp:extent cx="2862352" cy="536301"/>
                   <wp:effectExtent l="0" t="0" r="0" b="0"/>
                   <wp:docPr id="98981196" name="Picture 1"/>
@@ -2086,6 +1676,7 @@
         <w:ind w:left="400" w:hanging="10"/>
         <w:rPr>
           <w:rFonts w:ascii="Times New Roman" w:hAnsi="Times New Roman" w:cs="Times New Roman"/>
+          <w:szCs w:val="22"/>
         </w:rPr>
       </w:pPr>
     </w:p>
@@ -2095,6 +1686,7 @@
         <w:ind w:left="400" w:hanging="10"/>
         <w:rPr>
           <w:rFonts w:ascii="Times New Roman" w:hAnsi="Times New Roman" w:cs="Times New Roman"/>
+          <w:szCs w:val="22"/>
         </w:rPr>
       </w:pPr>
     </w:p>
@@ -2104,15 +1696,7 @@
         <w:ind w:left="400" w:hanging="10"/>
         <w:rPr>
           <w:rFonts w:ascii="Times New Roman" w:hAnsi="Times New Roman" w:cs="Times New Roman"/>
-        </w:rPr>
-      </w:pPr>
-    </w:p>
-    <w:p>
-      <w:pPr>
-        <w:spacing w:after="220" w:line="265" w:lineRule="auto"/>
-        <w:ind w:left="400" w:hanging="10"/>
-        <w:rPr>
-          <w:rFonts w:ascii="Times New Roman" w:hAnsi="Times New Roman" w:cs="Times New Roman"/>
+          <w:szCs w:val="22"/>
         </w:rPr>
       </w:pPr>
     </w:p>
@@ -2131,16 +1715,14 @@
         </w:tblBorders>
         <w:tblCellMar>
           <w:top w:w="14" w:type="dxa"/>
-          <w:left w:w="0" w:type="dxa"/>
-          <w:bottom w:w="0" w:type="dxa"/>
           <w:right w:w="115" w:type="dxa"/>
         </w:tblCellMar>
         <w:tblLook w:val="04A0" w:firstRow="1" w:lastRow="0" w:firstColumn="1" w:lastColumn="0" w:noHBand="0" w:noVBand="1"/>
       </w:tblPr>
       <w:tblGrid>
-        <w:gridCol w:w="1149"/>
-        <w:gridCol w:w="390"/>
-        <w:gridCol w:w="4290"/>
+        <w:gridCol w:w="1134"/>
+        <w:gridCol w:w="389"/>
+        <w:gridCol w:w="4306"/>
         <w:gridCol w:w="3876"/>
       </w:tblGrid>
       <w:tr>
@@ -2153,17 +1735,17 @@
           </w:tcPr>
           <w:p>
             <w:pPr>
-              <w:spacing w:after="0"/>
               <w:ind w:left="351"/>
               <w:rPr>
                 <w:rFonts w:ascii="Times New Roman" w:hAnsi="Times New Roman" w:cs="Times New Roman"/>
+                <w:szCs w:val="22"/>
               </w:rPr>
             </w:pPr>
             <w:r>
               <w:rPr>
                 <w:rFonts w:ascii="Times New Roman" w:eastAsia="Times New Roman" w:hAnsi="Times New Roman" w:cs="Times New Roman"/>
                 <w:b/>
-                <w:sz w:val="24"/>
+                <w:szCs w:val="22"/>
               </w:rPr>
               <w:t>Name of Panel</w:t>
             </w:r>
@@ -2177,6 +1759,7 @@
             <w:pPr>
               <w:rPr>
                 <w:rFonts w:ascii="Times New Roman" w:hAnsi="Times New Roman" w:cs="Times New Roman"/>
+                <w:szCs w:val="22"/>
               </w:rPr>
             </w:pPr>
           </w:p>
@@ -2187,16 +1770,16 @@
           </w:tcPr>
           <w:p>
             <w:pPr>
-              <w:spacing w:after="0"/>
-              <w:rPr>
-                <w:rFonts w:ascii="Times New Roman" w:hAnsi="Times New Roman" w:cs="Times New Roman"/>
+              <w:rPr>
+                <w:rFonts w:ascii="Times New Roman" w:hAnsi="Times New Roman" w:cs="Times New Roman"/>
+                <w:szCs w:val="22"/>
               </w:rPr>
             </w:pPr>
             <w:r>
               <w:rPr>
                 <w:rFonts w:ascii="Times New Roman" w:eastAsia="Times New Roman" w:hAnsi="Times New Roman" w:cs="Times New Roman"/>
                 <w:b/>
-                <w:sz w:val="24"/>
+                <w:szCs w:val="22"/>
               </w:rPr>
               <w:t>COMMENTS/SUGGESTIONS</w:t>
             </w:r>
@@ -2208,12 +1791,11 @@
           </w:tcPr>
           <w:p>
             <w:pPr>
-              <w:spacing w:after="0"/>
               <w:ind w:left="1323"/>
               <w:rPr>
                 <w:rFonts w:ascii="Times New Roman" w:eastAsia="Times New Roman" w:hAnsi="Times New Roman" w:cs="Times New Roman"/>
                 <w:b/>
-                <w:sz w:val="24"/>
+                <w:szCs w:val="22"/>
               </w:rPr>
             </w:pPr>
           </w:p>
@@ -2230,17 +1812,17 @@
           </w:tcPr>
           <w:p>
             <w:pPr>
-              <w:spacing w:after="0"/>
               <w:ind w:left="85"/>
               <w:rPr>
                 <w:rFonts w:ascii="Times New Roman" w:hAnsi="Times New Roman" w:cs="Times New Roman"/>
+                <w:szCs w:val="22"/>
               </w:rPr>
             </w:pPr>
             <w:r>
               <w:rPr>
                 <w:rFonts w:ascii="Times New Roman" w:eastAsia="Times New Roman" w:hAnsi="Times New Roman" w:cs="Times New Roman"/>
                 <w:b/>
-                <w:sz w:val="24"/>
+                <w:szCs w:val="22"/>
               </w:rPr>
               <w:t>Roanne Zoe Cayanan</w:t>
             </w:r>
@@ -2252,17 +1834,17 @@
           </w:tcPr>
           <w:p>
             <w:pPr>
-              <w:spacing w:after="0"/>
               <w:ind w:left="184"/>
               <w:jc w:val="center"/>
               <w:rPr>
                 <w:rFonts w:ascii="Times New Roman" w:hAnsi="Times New Roman" w:cs="Times New Roman"/>
-              </w:rPr>
-            </w:pPr>
-            <w:r>
-              <w:rPr>
-                <w:rFonts w:ascii="Times New Roman" w:eastAsia="Times New Roman" w:hAnsi="Times New Roman" w:cs="Times New Roman"/>
-                <w:sz w:val="24"/>
+                <w:szCs w:val="22"/>
+              </w:rPr>
+            </w:pPr>
+            <w:r>
+              <w:rPr>
+                <w:rFonts w:ascii="Times New Roman" w:eastAsia="Times New Roman" w:hAnsi="Times New Roman" w:cs="Times New Roman"/>
+                <w:szCs w:val="22"/>
               </w:rPr>
               <w:t>•</w:t>
             </w:r>
@@ -2274,15 +1856,15 @@
           </w:tcPr>
           <w:p>
             <w:pPr>
-              <w:spacing w:after="0"/>
-              <w:rPr>
-                <w:rFonts w:ascii="Times New Roman" w:hAnsi="Times New Roman" w:cs="Times New Roman"/>
-              </w:rPr>
-            </w:pPr>
-            <w:r>
-              <w:rPr>
-                <w:rFonts w:ascii="Times New Roman" w:eastAsia="Times New Roman" w:hAnsi="Times New Roman" w:cs="Times New Roman"/>
-                <w:sz w:val="24"/>
+              <w:rPr>
+                <w:rFonts w:ascii="Times New Roman" w:hAnsi="Times New Roman" w:cs="Times New Roman"/>
+                <w:szCs w:val="22"/>
+              </w:rPr>
+            </w:pPr>
+            <w:r>
+              <w:rPr>
+                <w:rFonts w:ascii="Times New Roman" w:eastAsia="Times New Roman" w:hAnsi="Times New Roman" w:cs="Times New Roman"/>
+                <w:szCs w:val="22"/>
               </w:rPr>
               <w:t xml:space="preserve">Improve device demo specs for next time. </w:t>
             </w:r>
@@ -2294,16 +1876,16 @@
           </w:tcPr>
           <w:p>
             <w:pPr>
-              <w:spacing w:after="0"/>
-              <w:rPr>
-                <w:rFonts w:ascii="Times New Roman" w:eastAsia="Times New Roman" w:hAnsi="Times New Roman" w:cs="Times New Roman"/>
-                <w:sz w:val="24"/>
-              </w:rPr>
-            </w:pPr>
-            <w:r>
-              <w:rPr>
-                <w:rFonts w:ascii="Times New Roman" w:eastAsia="Times New Roman" w:hAnsi="Times New Roman" w:cs="Times New Roman"/>
-                <w:sz w:val="24"/>
+              <w:rPr>
+                <w:rFonts w:ascii="Times New Roman" w:eastAsia="Times New Roman" w:hAnsi="Times New Roman" w:cs="Times New Roman"/>
+                <w:szCs w:val="22"/>
+              </w:rPr>
+            </w:pPr>
+            <w:r>
+              <w:rPr>
+                <w:rFonts w:ascii="Times New Roman" w:eastAsia="Times New Roman" w:hAnsi="Times New Roman" w:cs="Times New Roman"/>
+                <w:noProof/>
+                <w:szCs w:val="22"/>
               </w:rPr>
               <w:drawing>
                 <wp:inline distT="0" distB="0" distL="0" distR="0" wp14:anchorId="6590B6C3" wp14:editId="653EDEB1">
@@ -2356,6 +1938,7 @@
             <w:pPr>
               <w:rPr>
                 <w:rFonts w:ascii="Times New Roman" w:hAnsi="Times New Roman" w:cs="Times New Roman"/>
+                <w:szCs w:val="22"/>
               </w:rPr>
             </w:pPr>
           </w:p>
@@ -2366,17 +1949,17 @@
           </w:tcPr>
           <w:p>
             <w:pPr>
-              <w:spacing w:after="0"/>
               <w:ind w:left="184"/>
               <w:jc w:val="center"/>
               <w:rPr>
                 <w:rFonts w:ascii="Times New Roman" w:hAnsi="Times New Roman" w:cs="Times New Roman"/>
-              </w:rPr>
-            </w:pPr>
-            <w:r>
-              <w:rPr>
-                <w:rFonts w:ascii="Times New Roman" w:eastAsia="Times New Roman" w:hAnsi="Times New Roman" w:cs="Times New Roman"/>
-                <w:sz w:val="24"/>
+                <w:szCs w:val="22"/>
+              </w:rPr>
+            </w:pPr>
+            <w:r>
+              <w:rPr>
+                <w:rFonts w:ascii="Times New Roman" w:eastAsia="Times New Roman" w:hAnsi="Times New Roman" w:cs="Times New Roman"/>
+                <w:szCs w:val="22"/>
               </w:rPr>
               <w:t>•</w:t>
             </w:r>
@@ -2388,15 +1971,15 @@
           </w:tcPr>
           <w:p>
             <w:pPr>
-              <w:spacing w:after="0"/>
-              <w:rPr>
-                <w:rFonts w:ascii="Times New Roman" w:hAnsi="Times New Roman" w:cs="Times New Roman"/>
-              </w:rPr>
-            </w:pPr>
-            <w:r>
-              <w:rPr>
-                <w:rFonts w:ascii="Times New Roman" w:eastAsia="Times New Roman" w:hAnsi="Times New Roman" w:cs="Times New Roman"/>
-                <w:sz w:val="24"/>
+              <w:rPr>
+                <w:rFonts w:ascii="Times New Roman" w:hAnsi="Times New Roman" w:cs="Times New Roman"/>
+                <w:szCs w:val="22"/>
+              </w:rPr>
+            </w:pPr>
+            <w:r>
+              <w:rPr>
+                <w:rFonts w:ascii="Times New Roman" w:eastAsia="Times New Roman" w:hAnsi="Times New Roman" w:cs="Times New Roman"/>
+                <w:szCs w:val="22"/>
               </w:rPr>
               <w:t xml:space="preserve">Identification of other vehicle types is not important here. </w:t>
             </w:r>
@@ -2408,16 +1991,15 @@
           </w:tcPr>
           <w:p>
             <w:pPr>
-              <w:spacing w:after="0"/>
-              <w:rPr>
-                <w:rFonts w:ascii="Times New Roman" w:eastAsia="Times New Roman" w:hAnsi="Times New Roman" w:cs="Times New Roman"/>
-                <w:sz w:val="24"/>
-              </w:rPr>
-            </w:pPr>
-            <w:r>
-              <w:rPr>
-                <w:rFonts w:ascii="Times New Roman" w:eastAsia="Times New Roman" w:hAnsi="Times New Roman" w:cs="Times New Roman"/>
-                <w:sz w:val="24"/>
+              <w:rPr>
+                <w:rFonts w:ascii="Times New Roman" w:eastAsia="Times New Roman" w:hAnsi="Times New Roman" w:cs="Times New Roman"/>
+                <w:szCs w:val="22"/>
+              </w:rPr>
+            </w:pPr>
+            <w:r>
+              <w:rPr>
+                <w:rFonts w:ascii="Times New Roman" w:eastAsia="Times New Roman" w:hAnsi="Times New Roman" w:cs="Times New Roman"/>
+                <w:szCs w:val="22"/>
               </w:rPr>
               <w:t>We have implemented a hardware scanner for the system so the user can know if the device can handle the project</w:t>
             </w:r>
@@ -2436,6 +2018,7 @@
             <w:pPr>
               <w:rPr>
                 <w:rFonts w:ascii="Times New Roman" w:hAnsi="Times New Roman" w:cs="Times New Roman"/>
+                <w:szCs w:val="22"/>
               </w:rPr>
             </w:pPr>
           </w:p>
@@ -2446,17 +2029,17 @@
           </w:tcPr>
           <w:p>
             <w:pPr>
-              <w:spacing w:after="0"/>
               <w:ind w:left="184"/>
               <w:jc w:val="center"/>
               <w:rPr>
                 <w:rFonts w:ascii="Times New Roman" w:hAnsi="Times New Roman" w:cs="Times New Roman"/>
-              </w:rPr>
-            </w:pPr>
-            <w:r>
-              <w:rPr>
-                <w:rFonts w:ascii="Times New Roman" w:eastAsia="Times New Roman" w:hAnsi="Times New Roman" w:cs="Times New Roman"/>
-                <w:sz w:val="24"/>
+                <w:szCs w:val="22"/>
+              </w:rPr>
+            </w:pPr>
+            <w:r>
+              <w:rPr>
+                <w:rFonts w:ascii="Times New Roman" w:eastAsia="Times New Roman" w:hAnsi="Times New Roman" w:cs="Times New Roman"/>
+                <w:szCs w:val="22"/>
               </w:rPr>
               <w:t>•</w:t>
             </w:r>
@@ -2468,15 +2051,15 @@
           </w:tcPr>
           <w:p>
             <w:pPr>
-              <w:spacing w:after="0"/>
-              <w:rPr>
-                <w:rFonts w:ascii="Times New Roman" w:hAnsi="Times New Roman" w:cs="Times New Roman"/>
-              </w:rPr>
-            </w:pPr>
-            <w:r>
-              <w:rPr>
-                <w:rFonts w:ascii="Times New Roman" w:eastAsia="Times New Roman" w:hAnsi="Times New Roman" w:cs="Times New Roman"/>
-                <w:sz w:val="24"/>
+              <w:rPr>
+                <w:rFonts w:ascii="Times New Roman" w:hAnsi="Times New Roman" w:cs="Times New Roman"/>
+                <w:szCs w:val="22"/>
+              </w:rPr>
+            </w:pPr>
+            <w:r>
+              <w:rPr>
+                <w:rFonts w:ascii="Times New Roman" w:eastAsia="Times New Roman" w:hAnsi="Times New Roman" w:cs="Times New Roman"/>
+                <w:szCs w:val="22"/>
               </w:rPr>
               <w:t>Improve dashboard design.</w:t>
             </w:r>
@@ -2488,16 +2071,16 @@
           </w:tcPr>
           <w:p>
             <w:pPr>
-              <w:spacing w:after="0"/>
-              <w:rPr>
-                <w:rFonts w:ascii="Times New Roman" w:eastAsia="Times New Roman" w:hAnsi="Times New Roman" w:cs="Times New Roman"/>
-                <w:sz w:val="24"/>
-              </w:rPr>
-            </w:pPr>
-            <w:r>
-              <w:rPr>
-                <w:rFonts w:ascii="Times New Roman" w:eastAsia="Times New Roman" w:hAnsi="Times New Roman" w:cs="Times New Roman"/>
-                <w:sz w:val="24"/>
+              <w:rPr>
+                <w:rFonts w:ascii="Times New Roman" w:eastAsia="Times New Roman" w:hAnsi="Times New Roman" w:cs="Times New Roman"/>
+                <w:szCs w:val="22"/>
+              </w:rPr>
+            </w:pPr>
+            <w:r>
+              <w:rPr>
+                <w:rFonts w:ascii="Times New Roman" w:eastAsia="Times New Roman" w:hAnsi="Times New Roman" w:cs="Times New Roman"/>
+                <w:noProof/>
+                <w:szCs w:val="22"/>
               </w:rPr>
               <w:drawing>
                 <wp:inline distT="0" distB="0" distL="0" distR="0" wp14:anchorId="1AE2D910" wp14:editId="6ACA819E">
@@ -2548,16 +2131,16 @@
           </w:tcPr>
           <w:p>
             <w:pPr>
-              <w:spacing w:after="0"/>
-              <w:rPr>
-                <w:rFonts w:ascii="Times New Roman" w:hAnsi="Times New Roman" w:cs="Times New Roman"/>
+              <w:rPr>
+                <w:rFonts w:ascii="Times New Roman" w:hAnsi="Times New Roman" w:cs="Times New Roman"/>
+                <w:szCs w:val="22"/>
               </w:rPr>
             </w:pPr>
             <w:r>
               <w:rPr>
                 <w:rFonts w:ascii="Times New Roman" w:eastAsia="Times New Roman" w:hAnsi="Times New Roman" w:cs="Times New Roman"/>
                 <w:b/>
-                <w:sz w:val="24"/>
+                <w:szCs w:val="22"/>
               </w:rPr>
               <w:t>Name of Client</w:t>
             </w:r>
@@ -2570,17 +2153,17 @@
           </w:tcPr>
           <w:p>
             <w:pPr>
-              <w:spacing w:after="0"/>
               <w:ind w:right="152"/>
               <w:rPr>
                 <w:rFonts w:ascii="Times New Roman" w:hAnsi="Times New Roman" w:cs="Times New Roman"/>
+                <w:szCs w:val="22"/>
               </w:rPr>
             </w:pPr>
             <w:r>
               <w:rPr>
                 <w:rFonts w:ascii="Times New Roman" w:eastAsia="Times New Roman" w:hAnsi="Times New Roman" w:cs="Times New Roman"/>
                 <w:b/>
-                <w:sz w:val="24"/>
+                <w:szCs w:val="22"/>
               </w:rPr>
               <w:t>COMMENTS/SUGGESTIONS</w:t>
             </w:r>
@@ -2592,13 +2175,12 @@
           </w:tcPr>
           <w:p>
             <w:pPr>
-              <w:spacing w:after="0"/>
               <w:ind w:right="152"/>
               <w:jc w:val="center"/>
               <w:rPr>
                 <w:rFonts w:ascii="Times New Roman" w:eastAsia="Times New Roman" w:hAnsi="Times New Roman" w:cs="Times New Roman"/>
                 <w:b/>
-                <w:sz w:val="24"/>
+                <w:szCs w:val="22"/>
               </w:rPr>
             </w:pPr>
           </w:p>
@@ -2616,6 +2198,7 @@
             <w:pPr>
               <w:rPr>
                 <w:rFonts w:ascii="Times New Roman" w:hAnsi="Times New Roman" w:cs="Times New Roman"/>
+                <w:szCs w:val="22"/>
               </w:rPr>
             </w:pPr>
           </w:p>
@@ -2629,6 +2212,7 @@
             <w:pPr>
               <w:rPr>
                 <w:rFonts w:ascii="Times New Roman" w:hAnsi="Times New Roman" w:cs="Times New Roman"/>
+                <w:szCs w:val="22"/>
               </w:rPr>
             </w:pPr>
           </w:p>
@@ -2641,6 +2225,7 @@
             <w:pPr>
               <w:rPr>
                 <w:rFonts w:ascii="Times New Roman" w:hAnsi="Times New Roman" w:cs="Times New Roman"/>
+                <w:szCs w:val="22"/>
               </w:rPr>
             </w:pPr>
           </w:p>
@@ -2651,22 +2236,53 @@
       <w:pPr>
         <w:spacing w:after="0"/>
         <w:rPr>
-          <w:rFonts w:ascii="Times New Roman" w:hAnsi="Times New Roman" w:cs="Times New Roman"/>
-        </w:rPr>
-      </w:pPr>
-      <w:r>
-        <w:rPr>
           <w:rFonts w:ascii="Times New Roman" w:eastAsia="Cambria" w:hAnsi="Times New Roman" w:cs="Times New Roman"/>
           <w:b/>
-          <w:sz w:val="29"/>
-        </w:rPr>
-        <w:t>Overall</w:t>
-      </w:r>
-      <w:r>
+          <w:szCs w:val="22"/>
+        </w:rPr>
+      </w:pPr>
+    </w:p>
+    <w:p>
+      <w:pPr>
+        <w:spacing w:after="0"/>
         <w:rPr>
           <w:rFonts w:ascii="Times New Roman" w:eastAsia="Cambria" w:hAnsi="Times New Roman" w:cs="Times New Roman"/>
           <w:b/>
-          <w:sz w:val="29"/>
+          <w:szCs w:val="22"/>
+        </w:rPr>
+      </w:pPr>
+    </w:p>
+    <w:p>
+      <w:pPr>
+        <w:spacing w:after="0"/>
+        <w:rPr>
+          <w:rFonts w:ascii="Times New Roman" w:eastAsia="Cambria" w:hAnsi="Times New Roman" w:cs="Times New Roman"/>
+          <w:b/>
+          <w:szCs w:val="22"/>
+        </w:rPr>
+      </w:pPr>
+    </w:p>
+    <w:p>
+      <w:pPr>
+        <w:spacing w:after="0"/>
+        <w:rPr>
+          <w:rFonts w:ascii="Times New Roman" w:hAnsi="Times New Roman" w:cs="Times New Roman"/>
+          <w:szCs w:val="22"/>
+        </w:rPr>
+      </w:pPr>
+      <w:r>
+        <w:rPr>
+          <w:rFonts w:ascii="Times New Roman" w:eastAsia="Cambria" w:hAnsi="Times New Roman" w:cs="Times New Roman"/>
+          <w:b/>
+          <w:szCs w:val="22"/>
+        </w:rPr>
+        <w:t>Overall</w:t>
+      </w:r>
+      <w:r>
+        <w:rPr>
+          <w:rFonts w:ascii="Times New Roman" w:eastAsia="Cambria" w:hAnsi="Times New Roman" w:cs="Times New Roman"/>
+          <w:b/>
+          <w:szCs w:val="22"/>
         </w:rPr>
         <w:tab/>
         <w:t>recommendation:</w:t>
@@ -2675,7 +2291,7 @@
         <w:rPr>
           <w:rFonts w:ascii="Times New Roman" w:eastAsia="Cambria" w:hAnsi="Times New Roman" w:cs="Times New Roman"/>
           <w:b/>
-          <w:sz w:val="29"/>
+          <w:szCs w:val="22"/>
         </w:rPr>
         <w:tab/>
       </w:r>
@@ -2686,19 +2302,20 @@
         <w:ind w:left="620" w:hanging="360"/>
         <w:rPr>
           <w:rFonts w:ascii="Times New Roman" w:hAnsi="Times New Roman" w:cs="Times New Roman"/>
+          <w:szCs w:val="22"/>
         </w:rPr>
       </w:pPr>
       <w:r>
         <w:rPr>
           <w:rFonts w:ascii="Times New Roman" w:eastAsia="Times New Roman" w:hAnsi="Times New Roman" w:cs="Times New Roman"/>
-          <w:sz w:val="29"/>
+          <w:szCs w:val="22"/>
         </w:rPr>
         <w:t>•</w:t>
       </w:r>
       <w:r>
         <w:rPr>
           <w:rFonts w:ascii="Times New Roman" w:eastAsia="Times New Roman" w:hAnsi="Times New Roman" w:cs="Times New Roman"/>
-          <w:sz w:val="29"/>
+          <w:szCs w:val="22"/>
         </w:rPr>
         <w:tab/>
         <w:t xml:space="preserve">Make sure to demo your system to your client and have them </w:t>
@@ -2707,7 +2324,7 @@
       <w:r>
         <w:rPr>
           <w:rFonts w:ascii="Times New Roman" w:eastAsia="Times New Roman" w:hAnsi="Times New Roman" w:cs="Times New Roman"/>
-          <w:sz w:val="29"/>
+          <w:szCs w:val="22"/>
         </w:rPr>
         <w:t>evaluate</w:t>
       </w:r>
@@ -2715,16 +2332,9 @@
       <w:r>
         <w:rPr>
           <w:rFonts w:ascii="Times New Roman" w:eastAsia="Times New Roman" w:hAnsi="Times New Roman" w:cs="Times New Roman"/>
-          <w:sz w:val="29"/>
-        </w:rPr>
-        <w:t>. Take pictures during demonstration and take notes of their comments.</w:t>
-      </w:r>
-      <w:r>
-        <w:rPr>
-          <w:rFonts w:ascii="Times New Roman" w:eastAsia="Times New Roman" w:hAnsi="Times New Roman" w:cs="Times New Roman"/>
-          <w:sz w:val="24"/>
-        </w:rPr>
-        <w:t xml:space="preserve"> </w:t>
+          <w:szCs w:val="22"/>
+        </w:rPr>
+        <w:t xml:space="preserve">. Take pictures during demonstration and take notes of their comments. </w:t>
       </w:r>
     </w:p>
     <w:p>
@@ -2732,174 +2342,382 @@
         <w:spacing w:after="54" w:line="265" w:lineRule="auto"/>
         <w:ind w:left="635" w:hanging="10"/>
         <w:rPr>
-          <w:rFonts w:ascii="Times New Roman" w:hAnsi="Times New Roman" w:cs="Times New Roman"/>
+          <w:rFonts w:ascii="Times New Roman" w:eastAsia="Times New Roman" w:hAnsi="Times New Roman" w:cs="Times New Roman"/>
+          <w:szCs w:val="22"/>
         </w:rPr>
       </w:pPr>
       <w:r>
         <w:rPr>
           <w:rFonts w:ascii="Times New Roman" w:eastAsia="Times New Roman" w:hAnsi="Times New Roman" w:cs="Times New Roman"/>
-          <w:sz w:val="24"/>
-        </w:rPr>
-        <w:t xml:space="preserve">Panel Verdict: </w:t>
+          <w:szCs w:val="22"/>
+          <w:u w:val="single"/>
+        </w:rPr>
+        <w:t>      ____</w:t>
+      </w:r>
+      <w:r>
+        <w:rPr>
+          <w:szCs w:val="22"/>
+        </w:rPr>
+        <w:t xml:space="preserve"> </w:t>
+      </w:r>
+      <w:r>
+        <w:rPr>
+          <w:rFonts w:ascii="Times New Roman" w:eastAsia="Times New Roman" w:hAnsi="Times New Roman" w:cs="Times New Roman"/>
+          <w:szCs w:val="22"/>
+          <w:u w:val="single"/>
+        </w:rPr>
+        <w:t>Peter Joseph G. Rabanes</w:t>
+      </w:r>
+      <w:r>
+        <w:rPr>
+          <w:rFonts w:ascii="Times New Roman" w:eastAsia="Times New Roman" w:hAnsi="Times New Roman" w:cs="Times New Roman"/>
+          <w:szCs w:val="22"/>
+          <w:u w:val="single"/>
+        </w:rPr>
+        <w:t xml:space="preserve"> </w:t>
+      </w:r>
+      <w:r>
+        <w:rPr>
+          <w:rFonts w:ascii="Times New Roman" w:eastAsia="Times New Roman" w:hAnsi="Times New Roman" w:cs="Times New Roman"/>
+          <w:szCs w:val="22"/>
+          <w:u w:val="single"/>
+        </w:rPr>
+        <w:t>_________</w:t>
+      </w:r>
+      <w:r>
+        <w:rPr>
+          <w:rFonts w:ascii="Times New Roman" w:eastAsia="Times New Roman" w:hAnsi="Times New Roman" w:cs="Times New Roman"/>
+          <w:szCs w:val="22"/>
+        </w:rPr>
+        <w:tab/>
+      </w:r>
+      <w:r>
+        <w:rPr>
+          <w:rFonts w:ascii="Times New Roman" w:eastAsia="Times New Roman" w:hAnsi="Times New Roman" w:cs="Times New Roman"/>
+          <w:szCs w:val="22"/>
+        </w:rPr>
+        <w:t xml:space="preserve">                  </w:t>
+      </w:r>
+      <w:r>
+        <w:rPr>
+          <w:rFonts w:ascii="Times New Roman" w:eastAsia="Times New Roman" w:hAnsi="Times New Roman" w:cs="Times New Roman"/>
+          <w:szCs w:val="22"/>
+          <w:u w:val="single"/>
+        </w:rPr>
+        <w:t xml:space="preserve">_______Dr. Jovelin M. </w:t>
+      </w:r>
+      <w:proofErr w:type="spellStart"/>
+      <w:r>
+        <w:rPr>
+          <w:rFonts w:ascii="Times New Roman" w:eastAsia="Times New Roman" w:hAnsi="Times New Roman" w:cs="Times New Roman"/>
+          <w:szCs w:val="22"/>
+          <w:u w:val="single"/>
+        </w:rPr>
+        <w:t>Lapates</w:t>
+      </w:r>
+      <w:proofErr w:type="spellEnd"/>
+      <w:r>
+        <w:rPr>
+          <w:rFonts w:ascii="Times New Roman" w:eastAsia="Times New Roman" w:hAnsi="Times New Roman" w:cs="Times New Roman"/>
+          <w:szCs w:val="22"/>
+          <w:u w:val="single"/>
+        </w:rPr>
+        <w:t>__________</w:t>
       </w:r>
     </w:p>
     <w:p>
       <w:pPr>
-        <w:spacing w:after="472" w:line="293" w:lineRule="auto"/>
-        <w:ind w:left="1354" w:hanging="10"/>
-        <w:rPr>
-          <w:rFonts w:ascii="Times New Roman" w:hAnsi="Times New Roman" w:cs="Times New Roman"/>
+        <w:spacing w:after="54" w:line="265" w:lineRule="auto"/>
+        <w:ind w:left="635" w:hanging="10"/>
+        <w:rPr>
+          <w:rFonts w:ascii="Times New Roman" w:eastAsia="Times New Roman" w:hAnsi="Times New Roman" w:cs="Times New Roman"/>
+          <w:szCs w:val="22"/>
         </w:rPr>
       </w:pPr>
-      <w:proofErr w:type="gramStart"/>
-      <w:r>
-        <w:rPr>
-          <w:rFonts w:ascii="Times New Roman" w:eastAsia="Times New Roman" w:hAnsi="Times New Roman" w:cs="Times New Roman"/>
-          <w:b/>
-          <w:sz w:val="24"/>
-        </w:rPr>
-        <w:t>( )</w:t>
-      </w:r>
-      <w:proofErr w:type="gramEnd"/>
-      <w:r>
-        <w:rPr>
-          <w:rFonts w:ascii="Times New Roman" w:eastAsia="Times New Roman" w:hAnsi="Times New Roman" w:cs="Times New Roman"/>
-          <w:b/>
-          <w:sz w:val="24"/>
-        </w:rPr>
-        <w:t xml:space="preserve"> Approved with Minor Revision </w:t>
+      <w:r>
+        <w:rPr>
+          <w:rFonts w:ascii="Times New Roman" w:eastAsia="Times New Roman" w:hAnsi="Times New Roman" w:cs="Times New Roman"/>
+          <w:szCs w:val="22"/>
+        </w:rPr>
+        <w:t xml:space="preserve">Signature over Printed Name of Adviser </w:t>
+      </w:r>
+      <w:r>
+        <w:rPr>
+          <w:rFonts w:ascii="Times New Roman" w:eastAsia="Times New Roman" w:hAnsi="Times New Roman" w:cs="Times New Roman"/>
+          <w:szCs w:val="22"/>
+        </w:rPr>
+        <w:tab/>
+      </w:r>
+      <w:r>
+        <w:rPr>
+          <w:rFonts w:ascii="Times New Roman" w:eastAsia="Times New Roman" w:hAnsi="Times New Roman" w:cs="Times New Roman"/>
+          <w:szCs w:val="22"/>
+        </w:rPr>
+        <w:tab/>
+      </w:r>
+      <w:r>
+        <w:rPr>
+          <w:rFonts w:ascii="Times New Roman" w:eastAsia="Times New Roman" w:hAnsi="Times New Roman" w:cs="Times New Roman"/>
+          <w:szCs w:val="22"/>
+        </w:rPr>
+        <w:tab/>
+        <w:t>Signature over Printed Name of Instructor </w:t>
       </w:r>
     </w:p>
     <w:p>
       <w:pPr>
-        <w:spacing w:after="443" w:line="293" w:lineRule="auto"/>
-        <w:ind w:left="1354" w:hanging="10"/>
-        <w:rPr>
-          <w:rFonts w:ascii="Times New Roman" w:hAnsi="Times New Roman" w:cs="Times New Roman"/>
+        <w:spacing w:after="54" w:line="265" w:lineRule="auto"/>
+        <w:ind w:left="635" w:hanging="10"/>
+        <w:rPr>
+          <w:rFonts w:ascii="Times New Roman" w:eastAsia="Times New Roman" w:hAnsi="Times New Roman" w:cs="Times New Roman"/>
+          <w:szCs w:val="22"/>
         </w:rPr>
       </w:pPr>
-      <w:proofErr w:type="gramStart"/>
-      <w:r>
-        <w:rPr>
-          <w:rFonts w:ascii="Times New Roman" w:eastAsia="Times New Roman" w:hAnsi="Times New Roman" w:cs="Times New Roman"/>
-          <w:b/>
-          <w:sz w:val="24"/>
-        </w:rPr>
-        <w:t xml:space="preserve">( </w:t>
-      </w:r>
-      <w:r>
-        <w:rPr>
-          <w:rFonts w:ascii="Segoe UI Symbol" w:hAnsi="Segoe UI Symbol" w:cs="Segoe UI Symbol"/>
-          <w:b/>
-          <w:sz w:val="24"/>
-        </w:rPr>
-        <w:t>✓</w:t>
-      </w:r>
-      <w:proofErr w:type="gramEnd"/>
-      <w:r>
-        <w:rPr>
-          <w:rFonts w:ascii="Times New Roman" w:eastAsia="Arial" w:hAnsi="Times New Roman" w:cs="Times New Roman"/>
-          <w:b/>
-          <w:sz w:val="24"/>
-        </w:rPr>
-        <w:t xml:space="preserve"> </w:t>
-      </w:r>
-      <w:r>
-        <w:rPr>
-          <w:rFonts w:ascii="Times New Roman" w:eastAsia="Times New Roman" w:hAnsi="Times New Roman" w:cs="Times New Roman"/>
-          <w:b/>
-          <w:sz w:val="24"/>
-        </w:rPr>
-        <w:t xml:space="preserve">) Approved with Major Revision  </w:t>
-      </w:r>
     </w:p>
     <w:p>
       <w:pPr>
-        <w:spacing w:after="443" w:line="293" w:lineRule="auto"/>
-        <w:ind w:left="1354" w:hanging="10"/>
-        <w:rPr>
-          <w:rFonts w:ascii="Times New Roman" w:hAnsi="Times New Roman" w:cs="Times New Roman"/>
+        <w:spacing w:after="54" w:line="265" w:lineRule="auto"/>
+        <w:ind w:left="635" w:hanging="10"/>
+        <w:rPr>
+          <w:rFonts w:ascii="Times New Roman" w:eastAsia="Times New Roman" w:hAnsi="Times New Roman" w:cs="Times New Roman"/>
+          <w:szCs w:val="22"/>
         </w:rPr>
       </w:pPr>
-      <w:proofErr w:type="gramStart"/>
-      <w:r>
-        <w:rPr>
-          <w:rFonts w:ascii="Times New Roman" w:eastAsia="Times New Roman" w:hAnsi="Times New Roman" w:cs="Times New Roman"/>
-          <w:b/>
-          <w:sz w:val="24"/>
-        </w:rPr>
-        <w:t>(  )</w:t>
-      </w:r>
-      <w:proofErr w:type="gramEnd"/>
-      <w:r>
-        <w:rPr>
-          <w:rFonts w:ascii="Times New Roman" w:eastAsia="Times New Roman" w:hAnsi="Times New Roman" w:cs="Times New Roman"/>
-          <w:b/>
-          <w:sz w:val="24"/>
-        </w:rPr>
-        <w:t xml:space="preserve"> Rejected    </w:t>
+      <w:r>
+        <w:rPr>
+          <w:rFonts w:ascii="Times New Roman" w:eastAsia="Times New Roman" w:hAnsi="Times New Roman" w:cs="Times New Roman"/>
+          <w:szCs w:val="22"/>
+        </w:rPr>
+        <w:t>Approved by:</w:t>
       </w:r>
     </w:p>
     <w:p>
       <w:pPr>
-        <w:spacing w:after="64"/>
-        <w:ind w:left="5201"/>
-        <w:rPr>
-          <w:rFonts w:ascii="Times New Roman" w:hAnsi="Times New Roman" w:cs="Times New Roman"/>
+        <w:spacing w:after="54" w:line="265" w:lineRule="auto"/>
+        <w:ind w:left="635" w:hanging="10"/>
+        <w:rPr>
+          <w:rFonts w:ascii="Times New Roman" w:eastAsia="Times New Roman" w:hAnsi="Times New Roman" w:cs="Times New Roman"/>
+          <w:szCs w:val="22"/>
         </w:rPr>
       </w:pPr>
-      <w:r>
-        <w:rPr>
-          <w:rFonts w:ascii="Times New Roman" w:eastAsia="Times New Roman" w:hAnsi="Times New Roman" w:cs="Times New Roman"/>
-          <w:b/>
-          <w:sz w:val="24"/>
-        </w:rPr>
-        <w:t xml:space="preserve">          </w:t>
-      </w:r>
-      <w:proofErr w:type="spellStart"/>
-      <w:r>
-        <w:rPr>
-          <w:rFonts w:ascii="Times New Roman" w:eastAsia="Times New Roman" w:hAnsi="Times New Roman" w:cs="Times New Roman"/>
-          <w:b/>
-          <w:sz w:val="24"/>
-          <w:u w:val="single" w:color="000000"/>
-        </w:rPr>
-        <w:t>Czarissa</w:t>
-      </w:r>
-      <w:proofErr w:type="spellEnd"/>
-      <w:r>
-        <w:rPr>
-          <w:rFonts w:ascii="Times New Roman" w:eastAsia="Times New Roman" w:hAnsi="Times New Roman" w:cs="Times New Roman"/>
-          <w:b/>
-          <w:sz w:val="24"/>
-          <w:u w:val="single" w:color="000000"/>
-        </w:rPr>
-        <w:t xml:space="preserve"> Louise A. Navidad</w:t>
-      </w:r>
-      <w:r>
-        <w:rPr>
-          <w:rFonts w:ascii="Times New Roman" w:eastAsia="Times New Roman" w:hAnsi="Times New Roman" w:cs="Times New Roman"/>
-          <w:b/>
-          <w:sz w:val="24"/>
-        </w:rPr>
-        <w:t xml:space="preserve"> </w:t>
-      </w:r>
     </w:p>
     <w:p>
       <w:pPr>
-        <w:spacing w:after="2182" w:line="265" w:lineRule="auto"/>
-        <w:ind w:left="5211" w:hanging="10"/>
+        <w:spacing w:after="54" w:line="265" w:lineRule="auto"/>
+        <w:ind w:left="635" w:hanging="10"/>
+        <w:rPr>
+          <w:rFonts w:ascii="Times New Roman" w:eastAsia="Times New Roman" w:hAnsi="Times New Roman" w:cs="Times New Roman"/>
+          <w:szCs w:val="22"/>
+        </w:rPr>
+      </w:pPr>
+      <w:r>
+        <w:rPr>
+          <w:rFonts w:ascii="Times New Roman" w:eastAsia="Times New Roman" w:hAnsi="Times New Roman" w:cs="Times New Roman"/>
+          <w:szCs w:val="22"/>
+          <w:u w:val="single"/>
+        </w:rPr>
+        <w:t>              </w:t>
+      </w:r>
+      <w:r>
+        <w:rPr>
+          <w:rFonts w:ascii="Times New Roman" w:eastAsia="Times New Roman" w:hAnsi="Times New Roman" w:cs="Times New Roman"/>
+          <w:szCs w:val="22"/>
+          <w:u w:val="single"/>
+        </w:rPr>
+        <w:t>Anna Rose C. Tan</w:t>
+      </w:r>
+      <w:r>
+        <w:rPr>
+          <w:rFonts w:ascii="Times New Roman" w:eastAsia="Times New Roman" w:hAnsi="Times New Roman" w:cs="Times New Roman"/>
+          <w:szCs w:val="22"/>
+          <w:u w:val="single"/>
+        </w:rPr>
+        <w:t xml:space="preserve">                </w:t>
+      </w:r>
+      <w:r>
+        <w:rPr>
+          <w:rFonts w:ascii="Times New Roman" w:eastAsia="Times New Roman" w:hAnsi="Times New Roman" w:cs="Times New Roman"/>
+          <w:szCs w:val="22"/>
+        </w:rPr>
+        <w:tab/>
+      </w:r>
+      <w:r>
+        <w:rPr>
+          <w:rFonts w:ascii="Times New Roman" w:eastAsia="Times New Roman" w:hAnsi="Times New Roman" w:cs="Times New Roman"/>
+          <w:szCs w:val="22"/>
+        </w:rPr>
+        <w:tab/>
+      </w:r>
+      <w:r>
+        <w:rPr>
+          <w:rFonts w:ascii="Times New Roman" w:eastAsia="Times New Roman" w:hAnsi="Times New Roman" w:cs="Times New Roman"/>
+          <w:szCs w:val="22"/>
+        </w:rPr>
+        <w:tab/>
+        <w:t>_____</w:t>
+      </w:r>
+      <w:r>
+        <w:t xml:space="preserve"> </w:t>
+      </w:r>
+      <w:r>
+        <w:rPr>
+          <w:rFonts w:ascii="Times New Roman" w:eastAsia="Times New Roman" w:hAnsi="Times New Roman" w:cs="Times New Roman"/>
+          <w:szCs w:val="22"/>
+          <w:u w:val="single"/>
+        </w:rPr>
+        <w:t xml:space="preserve">Roanne Zoe Cayanan </w:t>
+      </w:r>
+      <w:r>
+        <w:rPr>
+          <w:rFonts w:ascii="Times New Roman" w:eastAsia="Times New Roman" w:hAnsi="Times New Roman" w:cs="Times New Roman"/>
+          <w:szCs w:val="22"/>
+        </w:rPr>
+        <w:t>_____</w:t>
+      </w:r>
+    </w:p>
+    <w:p>
+      <w:pPr>
+        <w:spacing w:after="54" w:line="265" w:lineRule="auto"/>
+        <w:ind w:left="635" w:hanging="10"/>
+        <w:rPr>
+          <w:rFonts w:ascii="Times New Roman" w:eastAsia="Times New Roman" w:hAnsi="Times New Roman" w:cs="Times New Roman"/>
+          <w:szCs w:val="22"/>
+        </w:rPr>
+      </w:pPr>
+      <w:r>
+        <w:rPr>
+          <w:rFonts w:ascii="Times New Roman" w:eastAsia="Times New Roman" w:hAnsi="Times New Roman" w:cs="Times New Roman"/>
+          <w:szCs w:val="22"/>
+        </w:rPr>
+        <w:t>                      Panel Member</w:t>
+      </w:r>
+      <w:r>
+        <w:rPr>
+          <w:rFonts w:ascii="Times New Roman" w:eastAsia="Times New Roman" w:hAnsi="Times New Roman" w:cs="Times New Roman"/>
+          <w:szCs w:val="22"/>
+        </w:rPr>
+        <w:tab/>
+      </w:r>
+      <w:r>
+        <w:rPr>
+          <w:rFonts w:ascii="Times New Roman" w:eastAsia="Times New Roman" w:hAnsi="Times New Roman" w:cs="Times New Roman"/>
+          <w:szCs w:val="22"/>
+        </w:rPr>
+        <w:tab/>
+      </w:r>
+      <w:r>
+        <w:rPr>
+          <w:rFonts w:ascii="Times New Roman" w:eastAsia="Times New Roman" w:hAnsi="Times New Roman" w:cs="Times New Roman"/>
+          <w:szCs w:val="22"/>
+        </w:rPr>
+        <w:tab/>
+      </w:r>
+      <w:r>
+        <w:rPr>
+          <w:rFonts w:ascii="Times New Roman" w:eastAsia="Times New Roman" w:hAnsi="Times New Roman" w:cs="Times New Roman"/>
+          <w:szCs w:val="22"/>
+        </w:rPr>
+        <w:tab/>
+        <w:t xml:space="preserve">                                   Panel Member</w:t>
+      </w:r>
+    </w:p>
+    <w:p>
+      <w:pPr>
+        <w:spacing w:after="54" w:line="265" w:lineRule="auto"/>
+        <w:ind w:left="635" w:hanging="10"/>
+        <w:rPr>
+          <w:rFonts w:ascii="Times New Roman" w:eastAsia="Times New Roman" w:hAnsi="Times New Roman" w:cs="Times New Roman"/>
+          <w:szCs w:val="22"/>
+        </w:rPr>
+      </w:pPr>
+    </w:p>
+    <w:p>
+      <w:pPr>
+        <w:spacing w:after="54" w:line="265" w:lineRule="auto"/>
+        <w:ind w:left="635" w:hanging="10"/>
+        <w:rPr>
+          <w:rFonts w:ascii="Times New Roman" w:eastAsia="Times New Roman" w:hAnsi="Times New Roman" w:cs="Times New Roman"/>
+          <w:szCs w:val="22"/>
+        </w:rPr>
+      </w:pPr>
+      <w:r>
+        <w:rPr>
+          <w:rFonts w:ascii="Times New Roman" w:eastAsia="Times New Roman" w:hAnsi="Times New Roman" w:cs="Times New Roman"/>
+          <w:szCs w:val="22"/>
+          <w:u w:val="single"/>
+        </w:rPr>
+        <w:t xml:space="preserve">____Dr. Rozanne Tuesday G. Flores               </w:t>
+      </w:r>
+      <w:r>
+        <w:rPr>
+          <w:rFonts w:ascii="Times New Roman" w:eastAsia="Times New Roman" w:hAnsi="Times New Roman" w:cs="Times New Roman"/>
+          <w:szCs w:val="22"/>
+        </w:rPr>
+        <w:tab/>
+      </w:r>
+      <w:r>
+        <w:rPr>
+          <w:rFonts w:ascii="Times New Roman" w:eastAsia="Times New Roman" w:hAnsi="Times New Roman" w:cs="Times New Roman"/>
+          <w:szCs w:val="22"/>
+        </w:rPr>
+        <w:tab/>
+      </w:r>
+      <w:r>
+        <w:rPr>
+          <w:rFonts w:ascii="Times New Roman" w:eastAsia="Times New Roman" w:hAnsi="Times New Roman" w:cs="Times New Roman"/>
+          <w:szCs w:val="22"/>
+        </w:rPr>
+        <w:tab/>
+        <w:t>                </w:t>
+      </w:r>
+    </w:p>
+    <w:p>
+      <w:pPr>
+        <w:spacing w:after="54" w:line="265" w:lineRule="auto"/>
+        <w:ind w:left="635" w:hanging="10"/>
+        <w:rPr>
+          <w:rFonts w:ascii="Times New Roman" w:eastAsia="Times New Roman" w:hAnsi="Times New Roman" w:cs="Times New Roman"/>
+          <w:szCs w:val="22"/>
+        </w:rPr>
+      </w:pPr>
+      <w:r>
+        <w:rPr>
+          <w:rFonts w:ascii="Times New Roman" w:eastAsia="Times New Roman" w:hAnsi="Times New Roman" w:cs="Times New Roman"/>
+          <w:szCs w:val="22"/>
+        </w:rPr>
+        <w:t>          REC/Chair</w:t>
+      </w:r>
+      <w:r>
+        <w:rPr>
+          <w:rFonts w:ascii="Times New Roman" w:eastAsia="Times New Roman" w:hAnsi="Times New Roman" w:cs="Times New Roman"/>
+          <w:szCs w:val="22"/>
+        </w:rPr>
+        <w:tab/>
+      </w:r>
+      <w:r>
+        <w:rPr>
+          <w:rFonts w:ascii="Times New Roman" w:eastAsia="Times New Roman" w:hAnsi="Times New Roman" w:cs="Times New Roman"/>
+          <w:szCs w:val="22"/>
+        </w:rPr>
+        <w:tab/>
+      </w:r>
+      <w:r>
+        <w:rPr>
+          <w:rFonts w:ascii="Times New Roman" w:eastAsia="Times New Roman" w:hAnsi="Times New Roman" w:cs="Times New Roman"/>
+          <w:szCs w:val="22"/>
+        </w:rPr>
+        <w:tab/>
+      </w:r>
+    </w:p>
+    <w:p>
+      <w:pPr>
+        <w:spacing w:after="54" w:line="265" w:lineRule="auto"/>
+        <w:ind w:left="635" w:hanging="10"/>
         <w:rPr>
           <w:rFonts w:ascii="Times New Roman" w:hAnsi="Times New Roman" w:cs="Times New Roman"/>
+          <w:szCs w:val="22"/>
         </w:rPr>
       </w:pPr>
-      <w:r>
-        <w:rPr>
-          <w:rFonts w:ascii="Times New Roman" w:eastAsia="Times New Roman" w:hAnsi="Times New Roman" w:cs="Times New Roman"/>
-          <w:sz w:val="24"/>
-        </w:rPr>
-        <w:t>Signature over Printed Name of Secretary</w:t>
-      </w:r>
     </w:p>
     <w:sectPr>
       <w:headerReference w:type="default" r:id="rId15"/>
@@ -3157,6 +2975,7 @@
   <w:p>
     <w:pPr>
       <w:pStyle w:val="Heading1"/>
+      <w:jc w:val="left"/>
     </w:pPr>
     <w:r>
       <w:rPr>
@@ -3203,6 +3022,18 @@
           </a:graphic>
         </wp:anchor>
       </w:drawing>
+    </w:r>
+    <w:r>
+      <w:t xml:space="preserve"> </w:t>
+    </w:r>
+    <w:r>
+      <w:tab/>
+    </w:r>
+    <w:r>
+      <w:tab/>
+    </w:r>
+    <w:r>
+      <w:tab/>
     </w:r>
     <w:r>
       <w:t>BUKIDNON STATE UNIVERSITY</w:t>
@@ -3872,6 +3703,18 @@
       <w:sz w:val="22"/>
     </w:rPr>
   </w:style>
+  <w:style w:type="paragraph" w:styleId="NormalWeb">
+    <w:name w:val="Normal (Web)"/>
+    <w:basedOn w:val="Normal"/>
+    <w:uiPriority w:val="99"/>
+    <w:semiHidden/>
+    <w:unhideWhenUsed/>
+    <w:rsid w:val="001F2A3A"/>
+    <w:rPr>
+      <w:rFonts w:ascii="Times New Roman" w:hAnsi="Times New Roman" w:cs="Times New Roman"/>
+      <w:sz w:val="24"/>
+    </w:rPr>
+  </w:style>
 </w:styles>
 </file>
 

</xml_diff>